<commit_message>
Added new tyaga report
</commit_message>
<xml_diff>
--- a/mechanics_of_controlled_motion/Отчет_по_параметрам_робота.docx
+++ b/mechanics_of_controlled_motion/Отчет_по_параметрам_робота.docx
@@ -19,14 +19,6 @@
         <w:gridCol w:w="9355"/>
       </w:tblGrid>
       <w:tr>
-        <w:tblPrEx>
-          <w:tblCellMar>
-            <w:top w:w="0" w:type="dxa"/>
-            <w:left w:w="0" w:type="dxa"/>
-            <w:bottom w:w="0" w:type="dxa"/>
-            <w:right w:w="0" w:type="dxa"/>
-          </w:tblCellMar>
-        </w:tblPrEx>
         <w:trPr>
           <w:trHeight w:val="180" w:hRule="atLeast"/>
         </w:trPr>
@@ -137,7 +129,7 @@
           </w:tcPr>
           <w:p>
             <w:pPr>
-              <w:pStyle w:val="14"/>
+              <w:pStyle w:val="8"/>
               <w:jc w:val="center"/>
             </w:pPr>
             <w:r>
@@ -152,7 +144,7 @@
           </w:p>
           <w:p>
             <w:pPr>
-              <w:pStyle w:val="14"/>
+              <w:pStyle w:val="8"/>
               <w:jc w:val="center"/>
               <w:rPr>
                 <w:b/>
@@ -363,7 +355,7 @@
     </w:p>
     <w:tbl>
       <w:tblPr>
-        <w:tblStyle w:val="21"/>
+        <w:tblStyle w:val="18"/>
         <w:tblW w:w="0" w:type="auto"/>
         <w:tblInd w:w="-601" w:type="dxa"/>
         <w:tblBorders>
@@ -639,7 +631,7 @@
     </w:p>
     <w:tbl>
       <w:tblPr>
-        <w:tblStyle w:val="21"/>
+        <w:tblStyle w:val="18"/>
         <w:tblW w:w="0" w:type="auto"/>
         <w:tblInd w:w="-601" w:type="dxa"/>
         <w:tblBorders>
@@ -1072,6 +1064,7 @@
       <w:pPr>
         <w:pStyle w:val="2"/>
         <w:numPr>
+          <w:ilvl w:val="0"/>
           <w:numId w:val="0"/>
         </w:numPr>
         <w:spacing w:after="120"/>
@@ -1131,7 +1124,7 @@
     </w:p>
     <w:p>
       <w:pPr>
-        <w:pStyle w:val="10"/>
+        <w:pStyle w:val="9"/>
         <w:bidi w:val="0"/>
         <w:rPr>
           <w:rFonts w:hint="default"/>
@@ -4746,7 +4739,45 @@
         <w:bidi w:val="0"/>
       </w:pPr>
       <w:r>
-        <w:t>Требования к приводной системе</w:t>
+        <w:rPr>
+          <w:lang w:val="ru-RU"/>
+        </w:rPr>
+        <w:t>Расчёт</w:t>
+      </w:r>
+      <w:r>
+        <w:rPr>
+          <w:rFonts w:hint="default"/>
+          <w:lang w:val="ru-RU"/>
+        </w:rPr>
+        <w:t xml:space="preserve"> требований к </w:t>
+      </w:r>
+      <w:r>
+        <w:t>приводной системе</w:t>
+      </w:r>
+    </w:p>
+    <w:p>
+      <w:pPr>
+        <w:spacing w:line="360" w:lineRule="auto"/>
+        <w:jc w:val="both"/>
+        <w:rPr>
+          <w:rFonts w:hint="default"/>
+          <w:b/>
+          <w:bCs/>
+          <w:i w:val="0"/>
+          <w:sz w:val="24"/>
+          <w:lang w:val="ru-RU"/>
+        </w:rPr>
+      </w:pPr>
+      <w:r>
+        <w:rPr>
+          <w:rFonts w:hint="default"/>
+          <w:b/>
+          <w:bCs/>
+          <w:i w:val="0"/>
+          <w:sz w:val="24"/>
+          <w:lang w:val="ru-RU"/>
+        </w:rPr>
+        <w:t>Условия:</w:t>
       </w:r>
     </w:p>
     <w:p>
@@ -4763,12 +4794,31 @@
       </w:pPr>
       <w:r>
         <w:rPr>
-          <w:rFonts w:ascii="Times New Roman" w:hAnsi="Times New Roman"/>
-          <w:b w:val="0"/>
-          <w:i w:val="0"/>
-          <w:sz w:val="24"/>
-        </w:rPr>
-        <w:t>На основе заданной скорости V_жел = 0.</w:t>
+          <w:b w:val="0"/>
+          <w:i w:val="0"/>
+          <w:sz w:val="24"/>
+          <w:lang w:val="ru-RU"/>
+        </w:rPr>
+        <w:t>Желаемая</w:t>
+      </w:r>
+      <w:r>
+        <w:rPr>
+          <w:rFonts w:hint="default"/>
+          <w:b w:val="0"/>
+          <w:i w:val="0"/>
+          <w:sz w:val="24"/>
+          <w:lang w:val="ru-RU"/>
+        </w:rPr>
+        <w:t xml:space="preserve"> скорость </w:t>
+      </w:r>
+      <w:r>
+        <w:rPr>
+          <w:rFonts w:ascii="Times New Roman" w:hAnsi="Times New Roman"/>
+          <w:b w:val="0"/>
+          <w:i w:val="0"/>
+          <w:sz w:val="24"/>
+        </w:rPr>
+        <w:t>V_жел = 0.</w:t>
       </w:r>
       <w:r>
         <w:rPr>
@@ -4787,93 +4837,7 @@
           <w:i w:val="0"/>
           <w:sz w:val="24"/>
         </w:rPr>
-        <w:t xml:space="preserve"> м/с, радиуса колеса r = 0.06 м, полной массы робота (с учётом платформы, двух ведущих и четырёх опорных колёс) m_общ = 7.448 + 2·0.68 + 4·0.02 = 8.</w:t>
-      </w:r>
-      <w:r>
-        <w:rPr>
-          <w:rFonts w:hint="default"/>
-          <w:b w:val="0"/>
-          <w:i w:val="0"/>
-          <w:sz w:val="24"/>
-          <w:lang w:val="ru-RU"/>
-        </w:rPr>
-        <w:t>888</w:t>
-      </w:r>
-      <w:r>
-        <w:rPr>
-          <w:rFonts w:ascii="Times New Roman" w:hAnsi="Times New Roman"/>
-          <w:b w:val="0"/>
-          <w:i w:val="0"/>
-          <w:sz w:val="24"/>
-        </w:rPr>
-        <w:t xml:space="preserve"> кг и </w:t>
-      </w:r>
-      <w:r>
-        <w:rPr>
-          <w:b w:val="0"/>
-          <w:i w:val="0"/>
-          <w:sz w:val="24"/>
-          <w:lang w:val="ru-RU"/>
-        </w:rPr>
-        <w:t>среднего</w:t>
-      </w:r>
-      <w:r>
-        <w:rPr>
-          <w:rFonts w:hint="default"/>
-          <w:b w:val="0"/>
-          <w:i w:val="0"/>
-          <w:sz w:val="24"/>
-          <w:lang w:val="ru-RU"/>
-        </w:rPr>
-        <w:t xml:space="preserve"> значения коэффициента сопротивлению качения </w:t>
-      </w:r>
-      <w:r>
-        <w:rPr>
-          <w:b w:val="0"/>
-          <w:i w:val="0"/>
-          <w:sz w:val="24"/>
-          <w:lang w:val="ru-RU"/>
-        </w:rPr>
-        <w:t>по</w:t>
-      </w:r>
-      <w:r>
-        <w:rPr>
-          <w:rFonts w:hint="default"/>
-          <w:b w:val="0"/>
-          <w:i w:val="0"/>
-          <w:sz w:val="24"/>
-          <w:lang w:val="ru-RU"/>
-        </w:rPr>
-        <w:t xml:space="preserve"> асфальту/бетону </w:t>
-      </w:r>
-      <w:r>
-        <w:rPr>
-          <w:rFonts w:hint="default"/>
-          <w:b w:val="0"/>
-          <w:i w:val="0"/>
-          <w:sz w:val="24"/>
-          <w:lang w:val="en-US"/>
-        </w:rPr>
-        <w:t xml:space="preserve">f </w:t>
-      </w:r>
-      <w:r>
-        <w:rPr>
-          <w:rFonts w:hint="default"/>
-          <w:b w:val="0"/>
-          <w:i w:val="0"/>
-          <w:sz w:val="24"/>
-          <w:lang w:val="ru-RU"/>
-        </w:rPr>
-        <w:t xml:space="preserve">= 0.05 </w:t>
-      </w:r>
-      <w:r>
-        <w:rPr>
-          <w:rFonts w:ascii="Times New Roman" w:hAnsi="Times New Roman"/>
-          <w:b w:val="0"/>
-          <w:i w:val="0"/>
-          <w:sz w:val="24"/>
-        </w:rPr>
-        <w:t>получены следующие значения:</w:t>
+        <w:t xml:space="preserve"> м/с, </w:t>
       </w:r>
     </w:p>
     <w:p>
@@ -4882,22 +4846,38 @@
         <w:ind w:firstLine="567"/>
         <w:jc w:val="both"/>
         <w:rPr>
-          <w:rFonts w:hint="default"/>
-          <w:b w:val="0"/>
-          <w:i w:val="0"/>
-          <w:sz w:val="24"/>
-          <w:lang w:val="en-US"/>
-        </w:rPr>
-      </w:pPr>
-      <w:r>
-        <w:rPr>
-          <w:rFonts w:hint="default"/>
-          <w:b w:val="0"/>
-          <w:i w:val="0"/>
-          <w:sz w:val="24"/>
-          <w:lang w:val="en-US"/>
-        </w:rPr>
-        <w:t>- Сила тяги F</w:t>
+          <w:rFonts w:ascii="Times New Roman" w:hAnsi="Times New Roman"/>
+          <w:b w:val="0"/>
+          <w:i w:val="0"/>
+          <w:sz w:val="24"/>
+        </w:rPr>
+      </w:pPr>
+      <w:r>
+        <w:rPr>
+          <w:b w:val="0"/>
+          <w:i w:val="0"/>
+          <w:sz w:val="24"/>
+          <w:lang w:val="ru-RU"/>
+        </w:rPr>
+        <w:t>Р</w:t>
+      </w:r>
+      <w:r>
+        <w:rPr>
+          <w:rFonts w:ascii="Times New Roman" w:hAnsi="Times New Roman"/>
+          <w:b w:val="0"/>
+          <w:i w:val="0"/>
+          <w:sz w:val="24"/>
+        </w:rPr>
+        <w:t xml:space="preserve">адиус </w:t>
+      </w:r>
+      <w:r>
+        <w:rPr>
+          <w:b w:val="0"/>
+          <w:i w:val="0"/>
+          <w:sz w:val="24"/>
+          <w:lang w:val="ru-RU"/>
+        </w:rPr>
+        <w:t>ведущего</w:t>
       </w:r>
       <w:r>
         <w:rPr>
@@ -4911,91 +4891,12 @@
       </w:r>
       <w:r>
         <w:rPr>
-          <w:rFonts w:hint="default"/>
-          <w:b w:val="0"/>
-          <w:i w:val="0"/>
-          <w:sz w:val="24"/>
-          <w:lang w:val="en-US"/>
-        </w:rPr>
-        <w:t>=</w:t>
-      </w:r>
-      <w:r>
-        <w:rPr>
-          <w:rFonts w:hint="default"/>
-          <w:b w:val="0"/>
-          <w:i w:val="0"/>
-          <w:sz w:val="24"/>
-          <w:lang w:val="ru-RU"/>
-        </w:rPr>
-        <w:t xml:space="preserve"> </w:t>
-      </w:r>
-      <w:r>
-        <w:rPr>
-          <w:rFonts w:hint="default"/>
-          <w:b w:val="0"/>
-          <w:i w:val="0"/>
-          <w:sz w:val="24"/>
-          <w:lang w:val="en-US"/>
-        </w:rPr>
-        <w:t>Rc =</w:t>
-      </w:r>
-      <w:r>
-        <w:rPr>
-          <w:rFonts w:hint="default"/>
-          <w:b w:val="0"/>
-          <w:i w:val="0"/>
-          <w:sz w:val="24"/>
-          <w:lang w:val="ru-RU"/>
-        </w:rPr>
-        <w:t xml:space="preserve"> </w:t>
-      </w:r>
-      <w:r>
-        <w:rPr>
-          <w:rFonts w:hint="default"/>
-          <w:b w:val="0"/>
-          <w:i w:val="0"/>
-          <w:sz w:val="24"/>
-          <w:lang w:val="en-US"/>
-        </w:rPr>
-        <w:t>f</w:t>
-      </w:r>
-      <w:r>
-        <w:rPr>
-          <w:rFonts w:ascii="Times New Roman" w:hAnsi="Times New Roman"/>
-          <w:b w:val="0"/>
-          <w:i w:val="0"/>
-          <w:sz w:val="24"/>
-        </w:rPr>
-        <w:t>·</w:t>
-      </w:r>
-      <w:r>
-        <w:rPr>
-          <w:rFonts w:hint="default"/>
-          <w:b w:val="0"/>
-          <w:i w:val="0"/>
-          <w:sz w:val="24"/>
-          <w:lang w:val="en-US"/>
-        </w:rPr>
-        <w:t>m</w:t>
-      </w:r>
-      <w:r>
-        <w:rPr>
-          <w:rFonts w:ascii="Times New Roman" w:hAnsi="Times New Roman"/>
-          <w:b w:val="0"/>
-          <w:i w:val="0"/>
-          <w:sz w:val="24"/>
-        </w:rPr>
-        <w:t>·</w:t>
-      </w:r>
-      <w:r>
-        <w:rPr>
-          <w:rFonts w:hint="default"/>
-          <w:b w:val="0"/>
-          <w:i w:val="0"/>
-          <w:sz w:val="24"/>
-          <w:lang w:val="en-US"/>
-        </w:rPr>
-        <w:t>g.</w:t>
+          <w:rFonts w:ascii="Times New Roman" w:hAnsi="Times New Roman"/>
+          <w:b w:val="0"/>
+          <w:i w:val="0"/>
+          <w:sz w:val="24"/>
+        </w:rPr>
+        <w:t xml:space="preserve">колеса r = 0.06 м, </w:t>
       </w:r>
     </w:p>
     <w:p>
@@ -5004,22 +4905,31 @@
         <w:ind w:firstLine="567"/>
         <w:jc w:val="both"/>
         <w:rPr>
-          <w:rFonts w:hint="default"/>
-          <w:b w:val="0"/>
-          <w:i w:val="0"/>
-          <w:sz w:val="24"/>
-          <w:lang w:val="ru-RU"/>
-        </w:rPr>
-      </w:pPr>
-      <w:r>
-        <w:rPr>
-          <w:rFonts w:hint="default"/>
-          <w:b w:val="0"/>
-          <w:i w:val="0"/>
-          <w:sz w:val="24"/>
-          <w:lang w:val="ru-RU"/>
-        </w:rPr>
-        <w:t>- Мощность механическая суммарная: P_мех</w:t>
+          <w:rFonts w:hint="default" w:ascii="Times New Roman" w:hAnsi="Times New Roman"/>
+          <w:b w:val="0"/>
+          <w:i w:val="0"/>
+          <w:sz w:val="24"/>
+          <w:lang w:val="ru-RU"/>
+        </w:rPr>
+      </w:pPr>
+      <w:r>
+        <w:rPr>
+          <w:b w:val="0"/>
+          <w:i w:val="0"/>
+          <w:sz w:val="24"/>
+          <w:lang w:val="ru-RU"/>
+        </w:rPr>
+        <w:t>Масса</w:t>
+      </w:r>
+      <w:r>
+        <w:rPr>
+          <w:rFonts w:hint="default"/>
+          <w:b w:val="0"/>
+          <w:i w:val="0"/>
+          <w:sz w:val="24"/>
+          <w:lang w:val="ru-RU"/>
+        </w:rPr>
+        <w:t xml:space="preserve"> платформы, и колёс </w:t>
       </w:r>
       <w:r>
         <w:rPr>
@@ -5029,190 +4939,45 @@
           <w:sz w:val="24"/>
           <w:lang w:val="en-US"/>
         </w:rPr>
-        <w:t xml:space="preserve"> =</w:t>
-      </w:r>
-      <w:r>
-        <w:rPr>
-          <w:rFonts w:hint="default"/>
-          <w:b w:val="0"/>
-          <w:i w:val="0"/>
-          <w:sz w:val="24"/>
-          <w:lang w:val="ru-RU"/>
-        </w:rPr>
-        <w:t xml:space="preserve"> F</w:t>
-      </w:r>
-      <w:r>
-        <w:rPr>
-          <w:rFonts w:ascii="Times New Roman" w:hAnsi="Times New Roman"/>
-          <w:b w:val="0"/>
-          <w:i w:val="0"/>
-          <w:sz w:val="24"/>
-        </w:rPr>
-        <w:t>·</w:t>
-      </w:r>
-      <w:r>
-        <w:rPr>
-          <w:rFonts w:hint="default"/>
-          <w:b w:val="0"/>
-          <w:i w:val="0"/>
-          <w:sz w:val="24"/>
-          <w:lang w:val="ru-RU"/>
-        </w:rPr>
-        <w:t>V</w:t>
-      </w:r>
-      <w:r>
-        <w:rPr>
-          <w:rFonts w:hint="default"/>
-          <w:b w:val="0"/>
-          <w:i w:val="0"/>
-          <w:sz w:val="24"/>
-          <w:lang w:val="en-US"/>
-        </w:rPr>
-        <w:t xml:space="preserve"> =</w:t>
-      </w:r>
-      <w:r>
-        <w:rPr>
-          <w:rFonts w:hint="default"/>
-          <w:b w:val="0"/>
-          <w:i w:val="0"/>
-          <w:sz w:val="24"/>
-          <w:lang w:val="ru-RU"/>
-        </w:rPr>
-        <w:t xml:space="preserve"> f</w:t>
-      </w:r>
-      <w:r>
-        <w:rPr>
-          <w:rFonts w:ascii="Times New Roman" w:hAnsi="Times New Roman"/>
-          <w:b w:val="0"/>
-          <w:i w:val="0"/>
-          <w:sz w:val="24"/>
-        </w:rPr>
-        <w:t>·</w:t>
-      </w:r>
-      <w:r>
-        <w:rPr>
-          <w:rFonts w:hint="default"/>
-          <w:b w:val="0"/>
-          <w:i w:val="0"/>
-          <w:sz w:val="24"/>
-          <w:lang w:val="ru-RU"/>
-        </w:rPr>
-        <w:t>m</w:t>
-      </w:r>
-      <w:r>
-        <w:rPr>
-          <w:rFonts w:ascii="Times New Roman" w:hAnsi="Times New Roman"/>
-          <w:b w:val="0"/>
-          <w:i w:val="0"/>
-          <w:sz w:val="24"/>
-        </w:rPr>
-        <w:t>·</w:t>
-      </w:r>
-      <w:r>
-        <w:rPr>
-          <w:rFonts w:hint="default"/>
-          <w:b w:val="0"/>
-          <w:i w:val="0"/>
-          <w:sz w:val="24"/>
-          <w:lang w:val="ru-RU"/>
-        </w:rPr>
-        <w:t>g</w:t>
-      </w:r>
-      <w:r>
-        <w:rPr>
-          <w:rFonts w:ascii="Times New Roman" w:hAnsi="Times New Roman"/>
-          <w:b w:val="0"/>
-          <w:i w:val="0"/>
-          <w:sz w:val="24"/>
-        </w:rPr>
-        <w:t>·</w:t>
-      </w:r>
-      <w:r>
-        <w:rPr>
-          <w:rFonts w:hint="default"/>
-          <w:b w:val="0"/>
-          <w:i w:val="0"/>
-          <w:sz w:val="24"/>
-          <w:lang w:val="ru-RU"/>
-        </w:rPr>
-        <w:t>V</w:t>
-      </w:r>
-      <w:r>
-        <w:rPr>
-          <w:rFonts w:hint="default"/>
-          <w:b w:val="0"/>
-          <w:i w:val="0"/>
-          <w:sz w:val="24"/>
-          <w:lang w:val="en-US"/>
-        </w:rPr>
-        <w:t xml:space="preserve"> = 0.7</w:t>
-      </w:r>
-      <w:r>
-        <w:rPr>
-          <w:rFonts w:ascii="Times New Roman" w:hAnsi="Times New Roman"/>
-          <w:b w:val="0"/>
-          <w:i w:val="0"/>
-          <w:sz w:val="24"/>
-        </w:rPr>
-        <w:t>·</w:t>
-      </w:r>
-      <w:r>
-        <w:rPr>
-          <w:rFonts w:hint="default"/>
-          <w:b w:val="0"/>
-          <w:i w:val="0"/>
-          <w:sz w:val="24"/>
-          <w:lang w:val="en-US"/>
-        </w:rPr>
-        <w:t>8.888</w:t>
-      </w:r>
-      <w:r>
-        <w:rPr>
-          <w:rFonts w:ascii="Times New Roman" w:hAnsi="Times New Roman"/>
-          <w:b w:val="0"/>
-          <w:i w:val="0"/>
-          <w:sz w:val="24"/>
-        </w:rPr>
-        <w:t>·</w:t>
-      </w:r>
-      <w:r>
-        <w:rPr>
-          <w:rFonts w:hint="default"/>
-          <w:b w:val="0"/>
-          <w:i w:val="0"/>
-          <w:sz w:val="24"/>
-          <w:lang w:val="en-US"/>
-        </w:rPr>
-        <w:t>9.8</w:t>
-      </w:r>
-      <w:r>
-        <w:rPr>
-          <w:rFonts w:ascii="Times New Roman" w:hAnsi="Times New Roman"/>
-          <w:b w:val="0"/>
-          <w:i w:val="0"/>
-          <w:sz w:val="24"/>
-        </w:rPr>
-        <w:t>·</w:t>
-      </w:r>
-      <w:r>
-        <w:rPr>
-          <w:rFonts w:hint="default"/>
-          <w:b w:val="0"/>
-          <w:i w:val="0"/>
-          <w:sz w:val="24"/>
-          <w:lang w:val="en-US"/>
-        </w:rPr>
-        <w:t xml:space="preserve">0.05 = 3.048584 </w:t>
-      </w:r>
-      <w:r>
-        <w:rPr>
-          <w:rFonts w:hint="default"/>
-          <w:b w:val="0"/>
-          <w:i w:val="0"/>
-          <w:sz w:val="24"/>
-          <w:lang w:val="ru-RU"/>
-        </w:rPr>
-        <w:t>Вт.</w:t>
+        <w:t>m_</w:t>
+      </w:r>
+      <w:r>
+        <w:rPr>
+          <w:rFonts w:hint="default"/>
+          <w:b w:val="0"/>
+          <w:i w:val="0"/>
+          <w:sz w:val="24"/>
+          <w:lang w:val="ru-RU"/>
+        </w:rPr>
+        <w:t xml:space="preserve">пл </w:t>
+      </w:r>
+      <w:r>
+        <w:rPr>
+          <w:rFonts w:ascii="Times New Roman" w:hAnsi="Times New Roman"/>
+          <w:b w:val="0"/>
+          <w:i w:val="0"/>
+          <w:sz w:val="24"/>
+        </w:rPr>
+        <w:t>= 7.448 + 2·0.68 + 4·0.02 = 8.</w:t>
+      </w:r>
+      <w:r>
+        <w:rPr>
+          <w:rFonts w:hint="default"/>
+          <w:b w:val="0"/>
+          <w:i w:val="0"/>
+          <w:sz w:val="24"/>
+          <w:lang w:val="ru-RU"/>
+        </w:rPr>
+        <w:t>888</w:t>
+      </w:r>
+      <w:r>
+        <w:rPr>
+          <w:rFonts w:ascii="Times New Roman" w:hAnsi="Times New Roman"/>
+          <w:b w:val="0"/>
+          <w:i w:val="0"/>
+          <w:sz w:val="24"/>
+        </w:rPr>
+        <w:t xml:space="preserve"> кг</w:t>
       </w:r>
     </w:p>
     <w:p>
@@ -5221,39 +4986,95 @@
         <w:ind w:firstLine="567"/>
         <w:jc w:val="both"/>
         <w:rPr>
-          <w:rFonts w:ascii="Times New Roman" w:hAnsi="Times New Roman"/>
-          <w:b w:val="0"/>
-          <w:i w:val="0"/>
-          <w:sz w:val="24"/>
-        </w:rPr>
-      </w:pPr>
-      <w:r>
-        <w:rPr>
-          <w:rFonts w:ascii="Times New Roman" w:hAnsi="Times New Roman"/>
-          <w:b w:val="0"/>
-          <w:i w:val="0"/>
-          <w:sz w:val="24"/>
-        </w:rPr>
-        <w:t xml:space="preserve">- Мощность каждого двигателя: P_двиг = </w:t>
-      </w:r>
-      <w:r>
-        <w:rPr>
-          <w:rFonts w:hint="default"/>
-          <w:b w:val="0"/>
-          <w:i w:val="0"/>
-          <w:sz w:val="24"/>
-          <w:lang w:val="ru-RU"/>
-        </w:rPr>
-        <w:t>P_мех/2 = 1.524292</w:t>
-      </w:r>
-      <w:r>
-        <w:rPr>
-          <w:rFonts w:ascii="Times New Roman" w:hAnsi="Times New Roman"/>
-          <w:b w:val="0"/>
-          <w:i w:val="0"/>
-          <w:sz w:val="24"/>
-        </w:rPr>
-        <w:t xml:space="preserve"> Вт.</w:t>
+          <w:rFonts w:hint="default" w:ascii="Times New Roman" w:hAnsi="Times New Roman"/>
+          <w:b w:val="0"/>
+          <w:i w:val="0"/>
+          <w:sz w:val="24"/>
+          <w:lang w:val="ru-RU"/>
+        </w:rPr>
+      </w:pPr>
+      <w:r>
+        <w:rPr>
+          <w:b w:val="0"/>
+          <w:i w:val="0"/>
+          <w:sz w:val="24"/>
+          <w:lang w:val="ru-RU"/>
+        </w:rPr>
+        <w:t>П</w:t>
+      </w:r>
+      <w:r>
+        <w:rPr>
+          <w:rFonts w:ascii="Times New Roman" w:hAnsi="Times New Roman"/>
+          <w:b w:val="0"/>
+          <w:i w:val="0"/>
+          <w:sz w:val="24"/>
+        </w:rPr>
+        <w:t>олн</w:t>
+      </w:r>
+      <w:r>
+        <w:rPr>
+          <w:b w:val="0"/>
+          <w:i w:val="0"/>
+          <w:sz w:val="24"/>
+          <w:lang w:val="ru-RU"/>
+        </w:rPr>
+        <w:t>ая</w:t>
+      </w:r>
+      <w:r>
+        <w:rPr>
+          <w:rFonts w:ascii="Times New Roman" w:hAnsi="Times New Roman"/>
+          <w:b w:val="0"/>
+          <w:i w:val="0"/>
+          <w:sz w:val="24"/>
+        </w:rPr>
+        <w:t xml:space="preserve"> масс</w:t>
+      </w:r>
+      <w:r>
+        <w:rPr>
+          <w:b w:val="0"/>
+          <w:i w:val="0"/>
+          <w:sz w:val="24"/>
+          <w:lang w:val="ru-RU"/>
+        </w:rPr>
+        <w:t>а</w:t>
+      </w:r>
+      <w:r>
+        <w:rPr>
+          <w:rFonts w:ascii="Times New Roman" w:hAnsi="Times New Roman"/>
+          <w:b w:val="0"/>
+          <w:i w:val="0"/>
+          <w:sz w:val="24"/>
+        </w:rPr>
+        <w:t xml:space="preserve"> робота (с учётом платформы, двух ведущих и четырёх опорных колёс</w:t>
+      </w:r>
+      <w:r>
+        <w:rPr>
+          <w:rFonts w:hint="default"/>
+          <w:b w:val="0"/>
+          <w:i w:val="0"/>
+          <w:sz w:val="24"/>
+          <w:lang w:val="ru-RU"/>
+        </w:rPr>
+        <w:t xml:space="preserve"> и запаса на массу двигателей, батарей, сенсорного оборудования </w:t>
+      </w:r>
+      <w:r>
+        <w:rPr>
+          <w:rFonts w:ascii="Times New Roman" w:hAnsi="Times New Roman"/>
+          <w:b w:val="0"/>
+          <w:i w:val="0"/>
+          <w:sz w:val="24"/>
+        </w:rPr>
+        <w:t xml:space="preserve">) m_общ </w:t>
+      </w:r>
+      <w:r>
+        <w:rPr>
+          <w:rFonts w:hint="default"/>
+          <w:b w:val="0"/>
+          <w:i w:val="0"/>
+          <w:sz w:val="24"/>
+          <w:lang w:val="ru-RU"/>
+        </w:rPr>
+        <w:t>= 14 кг</w:t>
       </w:r>
     </w:p>
     <w:p>
@@ -5262,6 +5083,281 @@
         <w:ind w:firstLine="567"/>
         <w:jc w:val="both"/>
         <w:rPr>
+          <w:rFonts w:hint="default"/>
+          <w:b w:val="0"/>
+          <w:i w:val="0"/>
+          <w:sz w:val="24"/>
+          <w:lang w:val="ru-RU"/>
+        </w:rPr>
+      </w:pPr>
+      <w:r>
+        <w:rPr>
+          <w:rFonts w:hint="default"/>
+          <w:b w:val="0"/>
+          <w:i w:val="0"/>
+          <w:sz w:val="24"/>
+          <w:lang w:val="ru-RU"/>
+        </w:rPr>
+        <w:t xml:space="preserve">Среднее значение коэффициента сопротивлению качения </w:t>
+      </w:r>
+      <w:r>
+        <w:rPr>
+          <w:b w:val="0"/>
+          <w:i w:val="0"/>
+          <w:sz w:val="24"/>
+          <w:lang w:val="ru-RU"/>
+        </w:rPr>
+        <w:t>по</w:t>
+      </w:r>
+      <w:r>
+        <w:rPr>
+          <w:rFonts w:hint="default"/>
+          <w:b w:val="0"/>
+          <w:i w:val="0"/>
+          <w:sz w:val="24"/>
+          <w:lang w:val="ru-RU"/>
+        </w:rPr>
+        <w:t xml:space="preserve"> асфальту/бетону </w:t>
+      </w:r>
+      <w:r>
+        <w:rPr>
+          <w:rFonts w:hint="default"/>
+          <w:b w:val="0"/>
+          <w:i w:val="0"/>
+          <w:sz w:val="24"/>
+          <w:lang w:val="en-US"/>
+        </w:rPr>
+        <w:t xml:space="preserve">f </w:t>
+      </w:r>
+      <w:r>
+        <w:rPr>
+          <w:rFonts w:hint="default"/>
+          <w:b w:val="0"/>
+          <w:i w:val="0"/>
+          <w:sz w:val="24"/>
+          <w:lang w:val="ru-RU"/>
+        </w:rPr>
+        <w:t>= 0.05</w:t>
+      </w:r>
+    </w:p>
+    <w:p>
+      <w:pPr>
+        <w:spacing w:line="360" w:lineRule="auto"/>
+        <w:ind w:firstLine="567"/>
+        <w:jc w:val="both"/>
+        <w:rPr>
+          <w:rFonts w:hint="default"/>
+          <w:b w:val="0"/>
+          <w:i w:val="0"/>
+          <w:sz w:val="24"/>
+          <w:lang w:val="ru-RU"/>
+        </w:rPr>
+      </w:pPr>
+    </w:p>
+    <w:p>
+      <w:pPr>
+        <w:spacing w:line="360" w:lineRule="auto"/>
+        <w:jc w:val="both"/>
+        <w:rPr>
+          <w:rFonts w:hint="default"/>
+          <w:b/>
+          <w:bCs/>
+          <w:i w:val="0"/>
+          <w:sz w:val="24"/>
+          <w:lang w:val="ru-RU"/>
+        </w:rPr>
+      </w:pPr>
+      <w:r>
+        <w:rPr>
+          <w:rFonts w:hint="default"/>
+          <w:b/>
+          <w:bCs/>
+          <w:i w:val="0"/>
+          <w:sz w:val="24"/>
+          <w:lang w:val="ru-RU"/>
+        </w:rPr>
+        <w:t>Расчет:</w:t>
+      </w:r>
+    </w:p>
+    <w:p>
+      <w:pPr>
+        <w:spacing w:line="360" w:lineRule="auto"/>
+        <w:ind w:firstLine="708" w:firstLineChars="0"/>
+        <w:jc w:val="both"/>
+        <w:rPr>
+          <w:rFonts w:hint="default"/>
+          <w:b w:val="0"/>
+          <w:i w:val="0"/>
+          <w:sz w:val="24"/>
+          <w:lang w:val="ru-RU"/>
+        </w:rPr>
+      </w:pPr>
+      <w:r>
+        <w:rPr>
+          <w:rFonts w:hint="default"/>
+          <w:b w:val="0"/>
+          <w:i w:val="0"/>
+          <w:sz w:val="24"/>
+          <w:lang w:val="ru-RU"/>
+        </w:rPr>
+        <w:t>Мощность механическая: P_мех</w:t>
+      </w:r>
+      <w:r>
+        <w:rPr>
+          <w:rFonts w:hint="default"/>
+          <w:b w:val="0"/>
+          <w:i w:val="0"/>
+          <w:sz w:val="24"/>
+          <w:lang w:val="en-US"/>
+        </w:rPr>
+        <w:t xml:space="preserve"> =</w:t>
+      </w:r>
+      <w:r>
+        <w:rPr>
+          <w:rFonts w:hint="default"/>
+          <w:b w:val="0"/>
+          <w:i w:val="0"/>
+          <w:sz w:val="24"/>
+          <w:lang w:val="ru-RU"/>
+        </w:rPr>
+        <w:t xml:space="preserve"> m</w:t>
+      </w:r>
+      <w:r>
+        <w:rPr>
+          <w:rFonts w:ascii="Times New Roman" w:hAnsi="Times New Roman"/>
+          <w:b w:val="0"/>
+          <w:i w:val="0"/>
+          <w:sz w:val="24"/>
+        </w:rPr>
+        <w:t>·</w:t>
+      </w:r>
+      <w:r>
+        <w:rPr>
+          <w:rFonts w:hint="default"/>
+          <w:b w:val="0"/>
+          <w:i w:val="0"/>
+          <w:sz w:val="24"/>
+          <w:lang w:val="ru-RU"/>
+        </w:rPr>
+        <w:t>V</w:t>
+      </w:r>
+      <w:r>
+        <w:rPr>
+          <w:rFonts w:hint="default"/>
+          <w:b w:val="0"/>
+          <w:i w:val="0"/>
+          <w:sz w:val="24"/>
+          <w:lang w:val="en-US"/>
+        </w:rPr>
+        <w:t xml:space="preserve"> = 0.7</w:t>
+      </w:r>
+      <w:r>
+        <w:rPr>
+          <w:rFonts w:ascii="Times New Roman" w:hAnsi="Times New Roman"/>
+          <w:b w:val="0"/>
+          <w:i w:val="0"/>
+          <w:sz w:val="24"/>
+        </w:rPr>
+        <w:t>·</w:t>
+      </w:r>
+      <w:r>
+        <w:rPr>
+          <w:rFonts w:hint="default"/>
+          <w:b w:val="0"/>
+          <w:i w:val="0"/>
+          <w:sz w:val="24"/>
+          <w:lang w:val="en-US"/>
+        </w:rPr>
+        <w:t xml:space="preserve">14  =  9.8 </w:t>
+      </w:r>
+      <w:r>
+        <w:rPr>
+          <w:rFonts w:hint="default"/>
+          <w:b w:val="0"/>
+          <w:i w:val="0"/>
+          <w:sz w:val="24"/>
+          <w:lang w:val="ru-RU"/>
+        </w:rPr>
+        <w:t>Вт</w:t>
+      </w:r>
+      <w:r>
+        <w:rPr>
+          <w:rFonts w:hint="default" w:ascii="Times New Roman" w:hAnsi="Times New Roman" w:cs="Times New Roman"/>
+          <w:b w:val="0"/>
+          <w:i w:val="0"/>
+          <w:sz w:val="24"/>
+          <w:lang w:val="en-US"/>
+        </w:rPr>
+        <w:t xml:space="preserve"> ≈ </w:t>
+      </w:r>
+      <w:r>
+        <w:rPr>
+          <w:rFonts w:hint="default"/>
+          <w:b w:val="0"/>
+          <w:i w:val="0"/>
+          <w:sz w:val="24"/>
+          <w:lang w:val="en-US"/>
+        </w:rPr>
+        <w:t xml:space="preserve">10 </w:t>
+      </w:r>
+      <w:r>
+        <w:rPr>
+          <w:rFonts w:hint="default"/>
+          <w:b w:val="0"/>
+          <w:i w:val="0"/>
+          <w:sz w:val="24"/>
+          <w:lang w:val="ru-RU"/>
+        </w:rPr>
+        <w:t>Вт.</w:t>
+      </w:r>
+    </w:p>
+    <w:p>
+      <w:pPr>
+        <w:spacing w:line="360" w:lineRule="auto"/>
+        <w:ind w:firstLine="567"/>
+        <w:jc w:val="both"/>
+        <w:rPr>
+          <w:rFonts w:ascii="Times New Roman" w:hAnsi="Times New Roman"/>
+          <w:b w:val="0"/>
+          <w:i w:val="0"/>
+          <w:sz w:val="24"/>
+        </w:rPr>
+      </w:pPr>
+      <w:r>
+        <w:rPr>
+          <w:rFonts w:ascii="Times New Roman" w:hAnsi="Times New Roman"/>
+          <w:b w:val="0"/>
+          <w:i w:val="0"/>
+          <w:sz w:val="24"/>
+        </w:rPr>
+        <w:t xml:space="preserve">Мощность каждого двигателя: P_двиг = </w:t>
+      </w:r>
+      <w:r>
+        <w:rPr>
+          <w:rFonts w:hint="default"/>
+          <w:b w:val="0"/>
+          <w:i w:val="0"/>
+          <w:sz w:val="24"/>
+          <w:lang w:val="ru-RU"/>
+        </w:rPr>
+        <w:t xml:space="preserve">P_мех/2 = 5 </w:t>
+      </w:r>
+      <w:r>
+        <w:rPr>
+          <w:rFonts w:ascii="Times New Roman" w:hAnsi="Times New Roman"/>
+          <w:b w:val="0"/>
+          <w:i w:val="0"/>
+          <w:sz w:val="24"/>
+        </w:rPr>
+        <w:t>Вт.</w:t>
+      </w:r>
+    </w:p>
+    <w:p>
+      <w:pPr>
+        <w:spacing w:line="360" w:lineRule="auto"/>
+        <w:ind w:firstLine="567"/>
+        <w:jc w:val="both"/>
+        <w:rPr>
           <w:rFonts w:hint="default" w:ascii="Times New Roman" w:hAnsi="Times New Roman"/>
           <w:b w:val="0"/>
           <w:i w:val="0"/>
@@ -5269,16 +5365,6 @@
           <w:lang w:val="ru-RU"/>
         </w:rPr>
       </w:pPr>
-      <w:r>
-        <w:rPr>
-          <w:rFonts w:hint="default"/>
-          <w:b w:val="0"/>
-          <w:i w:val="0"/>
-          <w:sz w:val="24"/>
-          <w:lang w:val="en-US"/>
-        </w:rPr>
-        <w:t xml:space="preserve">- </w:t>
-      </w:r>
       <w:r>
         <w:rPr>
           <w:rFonts w:hint="default"/>
@@ -5319,7 +5405,6 @@
         </m:r>
       </m:oMath>
       <w:r>
-        <m:rPr/>
         <w:rPr>
           <w:rFonts w:hint="default" w:hAnsi="Cambria Math"/>
           <w:i w:val="0"/>
@@ -5329,7 +5414,6 @@
         <w:t xml:space="preserve"> = 11.67 </w:t>
       </w:r>
       <w:r>
-        <m:rPr/>
         <w:rPr>
           <w:rFonts w:hint="default" w:hAnsi="Cambria Math"/>
           <w:i w:val="0"/>
@@ -5344,15 +5428,19 @@
         <w:spacing w:line="360" w:lineRule="auto"/>
         <w:ind w:firstLine="567"/>
         <w:jc w:val="both"/>
-      </w:pPr>
-      <w:r>
-        <w:rPr>
-          <w:rFonts w:ascii="Times New Roman" w:hAnsi="Times New Roman"/>
-          <w:b w:val="0"/>
-          <w:i w:val="0"/>
-          <w:sz w:val="24"/>
-        </w:rPr>
-        <w:t>- Момент на каждом ведущем колесе: M_кол =</w:t>
+        <w:rPr>
+          <w:rFonts w:hint="default"/>
+          <w:lang w:val="ru-RU"/>
+        </w:rPr>
+      </w:pPr>
+      <w:r>
+        <w:rPr>
+          <w:rFonts w:ascii="Times New Roman" w:hAnsi="Times New Roman"/>
+          <w:b w:val="0"/>
+          <w:i w:val="0"/>
+          <w:sz w:val="24"/>
+        </w:rPr>
+        <w:t>Момент на каждом ведущем колесе: M_кол =</w:t>
       </w:r>
       <w:r>
         <w:rPr>
@@ -5395,7 +5483,6 @@
         </m:r>
       </m:oMath>
       <w:r>
-        <m:rPr/>
         <w:rPr>
           <w:rFonts w:hint="default" w:ascii="Times New Roman" w:hAnsi="Cambria Math"/>
           <w:i w:val="0"/>
@@ -5415,194 +5502,61 @@
       </w:r>
       <w:r>
         <w:rPr>
-          <w:rFonts w:hint="default"/>
-          <w:b w:val="0"/>
-          <w:i w:val="0"/>
-          <w:sz w:val="24"/>
-          <w:lang w:val="ru-RU"/>
-        </w:rPr>
-        <w:t>0.131</w:t>
-      </w:r>
-      <w:r>
-        <w:rPr>
-          <w:rFonts w:ascii="Times New Roman" w:hAnsi="Times New Roman"/>
-          <w:b w:val="0"/>
-          <w:i w:val="0"/>
-          <w:sz w:val="24"/>
-        </w:rPr>
-        <w:t xml:space="preserve"> Н·м.</w:t>
-      </w:r>
-    </w:p>
-    <w:p>
-      <w:pPr>
-        <w:spacing w:line="360" w:lineRule="auto"/>
-        <w:ind w:firstLine="567"/>
-        <w:jc w:val="both"/>
-      </w:pPr>
-      <w:r>
-        <w:rPr>
-          <w:rFonts w:ascii="Times New Roman" w:hAnsi="Times New Roman"/>
-          <w:b w:val="0"/>
-          <w:i w:val="0"/>
-          <w:sz w:val="24"/>
-        </w:rPr>
-        <w:t>- Суммарная потребляемая мощность</w:t>
-      </w:r>
-      <w:r>
-        <w:rPr>
-          <w:rFonts w:hint="default"/>
-          <w:b w:val="0"/>
-          <w:i w:val="0"/>
-          <w:sz w:val="24"/>
-          <w:lang w:val="ru-RU"/>
-        </w:rPr>
-        <w:t xml:space="preserve"> электрическая</w:t>
-      </w:r>
-      <w:r>
-        <w:rPr>
-          <w:rFonts w:ascii="Times New Roman" w:hAnsi="Times New Roman"/>
-          <w:b w:val="0"/>
-          <w:i w:val="0"/>
-          <w:sz w:val="24"/>
-        </w:rPr>
-        <w:t>: P</w:t>
-      </w:r>
-      <w:r>
-        <w:rPr>
-          <w:rFonts w:hint="default"/>
-          <w:b w:val="0"/>
-          <w:i w:val="0"/>
-          <w:sz w:val="24"/>
-          <w:lang w:val="ru-RU"/>
-        </w:rPr>
-        <w:t>_эл = Р_мех</w:t>
-      </w:r>
-      <w:r>
-        <w:rPr>
-          <w:rFonts w:ascii="Times New Roman" w:hAnsi="Times New Roman"/>
-          <w:b w:val="0"/>
-          <w:i w:val="0"/>
-          <w:sz w:val="24"/>
-        </w:rPr>
-        <w:t xml:space="preserve"> = </w:t>
-      </w:r>
-      <w:r>
-        <w:rPr>
-          <w:rFonts w:hint="default"/>
-          <w:b w:val="0"/>
-          <w:i w:val="0"/>
-          <w:sz w:val="24"/>
-          <w:lang w:val="ru-RU"/>
-        </w:rPr>
-        <w:t>3.</w:t>
-      </w:r>
-      <w:r>
-        <w:rPr>
-          <w:rFonts w:hint="default"/>
+          <w:rFonts w:hint="default" w:ascii="Times New Roman" w:hAnsi="Times New Roman"/>
+          <w:b w:val="0"/>
+          <w:i w:val="0"/>
+          <w:sz w:val="24"/>
+        </w:rPr>
+        <w:t>0.428</w:t>
+      </w:r>
+      <w:r>
+        <w:rPr>
+          <w:rFonts w:ascii="Times New Roman" w:hAnsi="Times New Roman"/>
+          <w:b w:val="0"/>
+          <w:i w:val="0"/>
+          <w:sz w:val="24"/>
+        </w:rPr>
+        <w:t xml:space="preserve"> Н·м</w:t>
+      </w:r>
+      <w:r>
+        <w:rPr>
+          <w:rFonts w:hint="default"/>
+          <w:b w:val="0"/>
+          <w:i w:val="0"/>
+          <w:sz w:val="24"/>
+          <w:lang w:val="ru-RU"/>
+        </w:rPr>
+        <w:t xml:space="preserve"> </w:t>
+      </w:r>
+      <w:r>
+        <w:rPr>
+          <w:rFonts w:hint="default" w:ascii="Times New Roman" w:hAnsi="Times New Roman" w:cs="Times New Roman"/>
           <w:b w:val="0"/>
           <w:i w:val="0"/>
           <w:sz w:val="24"/>
           <w:lang w:val="en-US"/>
         </w:rPr>
-        <w:t xml:space="preserve">048584 </w:t>
-      </w:r>
-      <w:r>
-        <w:rPr>
-          <w:rFonts w:ascii="Times New Roman" w:hAnsi="Times New Roman"/>
-          <w:b w:val="0"/>
-          <w:i w:val="0"/>
-          <w:sz w:val="24"/>
-        </w:rPr>
-        <w:t xml:space="preserve"> Вт.</w:t>
-      </w:r>
-    </w:p>
-    <w:p>
-      <w:pPr>
-        <w:spacing w:line="360" w:lineRule="auto"/>
-        <w:ind w:firstLine="567"/>
-        <w:jc w:val="both"/>
-        <w:rPr>
-          <w:rFonts w:ascii="Times New Roman" w:hAnsi="Times New Roman"/>
-          <w:b w:val="0"/>
-          <w:i w:val="0"/>
-          <w:sz w:val="24"/>
-        </w:rPr>
-      </w:pPr>
-      <w:r>
-        <w:rPr>
-          <w:rFonts w:ascii="Times New Roman" w:hAnsi="Times New Roman"/>
-          <w:b w:val="0"/>
-          <w:i w:val="0"/>
-          <w:sz w:val="24"/>
-        </w:rPr>
-        <w:t xml:space="preserve">- При времени работы 1 час от источника </w:t>
-      </w:r>
-      <w:r>
-        <w:rPr>
-          <w:rFonts w:hint="default"/>
-          <w:b w:val="0"/>
-          <w:i w:val="0"/>
-          <w:sz w:val="24"/>
-          <w:lang w:val="ru-RU"/>
-        </w:rPr>
-        <w:t>12</w:t>
-      </w:r>
-      <w:r>
-        <w:rPr>
-          <w:rFonts w:ascii="Times New Roman" w:hAnsi="Times New Roman"/>
-          <w:b w:val="0"/>
-          <w:i w:val="0"/>
-          <w:sz w:val="24"/>
-        </w:rPr>
-        <w:t xml:space="preserve"> В требуемая ёмкость аккумулятора: </w:t>
-      </w:r>
-      <w:r>
-        <w:rPr>
-          <w:rFonts w:hint="default"/>
-          <w:b w:val="0"/>
-          <w:i w:val="0"/>
-          <w:sz w:val="24"/>
-          <w:lang w:val="ru-RU"/>
-        </w:rPr>
-        <w:t>3.</w:t>
-      </w:r>
-      <w:r>
-        <w:rPr>
-          <w:rFonts w:hint="default"/>
-          <w:b w:val="0"/>
-          <w:i w:val="0"/>
-          <w:sz w:val="24"/>
-          <w:lang w:val="en-US"/>
-        </w:rPr>
-        <w:t>048584</w:t>
-      </w:r>
-      <w:r>
-        <w:rPr>
-          <w:rFonts w:ascii="Times New Roman" w:hAnsi="Times New Roman"/>
-          <w:b w:val="0"/>
-          <w:i w:val="0"/>
-          <w:sz w:val="24"/>
-        </w:rPr>
-        <w:t xml:space="preserve"> Вт·ч, ток </w:t>
-      </w:r>
-      <w:r>
-        <w:rPr>
-          <w:rFonts w:hint="default"/>
-          <w:b w:val="0"/>
-          <w:i w:val="0"/>
-          <w:sz w:val="24"/>
-          <w:lang w:val="ru-RU"/>
-        </w:rPr>
-        <w:t>0.254</w:t>
-      </w:r>
-      <w:r>
-        <w:rPr>
-          <w:rFonts w:ascii="Times New Roman" w:hAnsi="Times New Roman"/>
-          <w:b w:val="0"/>
-          <w:i w:val="0"/>
-          <w:sz w:val="24"/>
-        </w:rPr>
-        <w:t xml:space="preserve"> А.</w:t>
+        <w:t>≈</w:t>
+      </w:r>
+      <w:r>
+        <w:rPr>
+          <w:rFonts w:hint="default" w:ascii="Times New Roman" w:hAnsi="Times New Roman" w:cs="Times New Roman"/>
+          <w:b w:val="0"/>
+          <w:i w:val="0"/>
+          <w:sz w:val="24"/>
+          <w:lang w:val="ru-RU"/>
+        </w:rPr>
+        <w:t xml:space="preserve"> </w:t>
+      </w:r>
+      <w:r>
+        <w:rPr>
+          <w:rFonts w:hint="default"/>
+          <w:b w:val="0"/>
+          <w:i w:val="0"/>
+          <w:sz w:val="24"/>
+          <w:lang w:val="ru-RU"/>
+        </w:rPr>
+        <w:t>4.4 кг·см</w:t>
       </w:r>
     </w:p>
     <w:p>
@@ -5630,7 +5584,7 @@
     </w:p>
     <w:p>
       <w:pPr>
-        <w:pStyle w:val="19"/>
+        <w:pStyle w:val="17"/>
         <w:keepNext w:val="0"/>
         <w:keepLines w:val="0"/>
         <w:widowControl/>
@@ -5643,7 +5597,13 @@
         <w:br w:type="textWrapping"/>
       </w:r>
       <w:r>
-        <w:t>Коллекторный двигатель постоянного тока с возбуждением от постоянных магнитов MY0660</w:t>
+        <w:t xml:space="preserve">Коллекторный двигатель постоянного тока с возбуждением от постоянных магнитов </w:t>
+      </w:r>
+      <w:r>
+        <w:rPr>
+          <w:rFonts w:hint="default"/>
+        </w:rPr>
+        <w:t>JGY-370 6В (редуктор 1:260)</w:t>
       </w:r>
     </w:p>
     <w:p>
@@ -5665,7 +5625,7 @@
     </w:p>
     <w:tbl>
       <w:tblPr>
-        <w:tblStyle w:val="21"/>
+        <w:tblStyle w:val="18"/>
         <w:tblW w:w="0" w:type="auto"/>
         <w:tblInd w:w="0" w:type="dxa"/>
         <w:tblBorders>
@@ -5678,7 +5638,9 @@
         </w:tblBorders>
         <w:tblLayout w:type="autofit"/>
         <w:tblCellMar>
+          <w:top w:w="0" w:type="dxa"/>
           <w:left w:w="108" w:type="dxa"/>
+          <w:bottom w:w="0" w:type="dxa"/>
           <w:right w:w="108" w:type="dxa"/>
         </w:tblCellMar>
       </w:tblPr>
@@ -5696,6 +5658,12 @@
             <w:insideH w:val="single" w:color="auto" w:sz="4" w:space="0"/>
             <w:insideV w:val="single" w:color="auto" w:sz="4" w:space="0"/>
           </w:tblBorders>
+          <w:tblCellMar>
+            <w:top w:w="0" w:type="dxa"/>
+            <w:left w:w="108" w:type="dxa"/>
+            <w:bottom w:w="0" w:type="dxa"/>
+            <w:right w:w="108" w:type="dxa"/>
+          </w:tblCellMar>
         </w:tblPrEx>
         <w:tc>
           <w:tcPr>
@@ -5726,14 +5694,25 @@
             <w:pPr>
               <w:bidi w:val="0"/>
               <w:rPr>
+                <w:rFonts w:hint="default"/>
                 <w:vertAlign w:val="baseline"/>
-              </w:rPr>
-            </w:pPr>
-            <w:r>
-              <w:rPr>
-                <w:lang w:val="en-US" w:eastAsia="zh-CN"/>
-              </w:rPr>
-              <w:t>1:40</w:t>
+                <w:lang w:val="ru-RU"/>
+              </w:rPr>
+            </w:pPr>
+            <w:r>
+              <w:rPr>
+                <w:rFonts w:hint="default"/>
+                <w:vertAlign w:val="baseline"/>
+              </w:rPr>
+              <w:t>1:</w:t>
+            </w:r>
+            <w:r>
+              <w:rPr>
+                <w:rFonts w:hint="default"/>
+                <w:vertAlign w:val="baseline"/>
+                <w:lang w:val="ru-RU"/>
+              </w:rPr>
+              <w:t>90</w:t>
             </w:r>
           </w:p>
         </w:tc>
@@ -5749,7 +5728,9 @@
             <w:insideV w:val="single" w:color="auto" w:sz="4" w:space="0"/>
           </w:tblBorders>
           <w:tblCellMar>
+            <w:top w:w="0" w:type="dxa"/>
             <w:left w:w="108" w:type="dxa"/>
+            <w:bottom w:w="0" w:type="dxa"/>
             <w:right w:w="108" w:type="dxa"/>
           </w:tblCellMar>
         </w:tblPrEx>
@@ -5787,9 +5768,16 @@
             </w:pPr>
             <w:r>
               <w:rPr>
+                <w:rFonts w:hint="default"/>
+                <w:lang w:val="ru-RU" w:eastAsia="zh-CN"/>
+              </w:rPr>
+              <w:t xml:space="preserve">12 </w:t>
+            </w:r>
+            <w:r>
+              <w:rPr>
                 <w:lang w:val="en-US" w:eastAsia="zh-CN"/>
               </w:rPr>
-              <w:t>6В</w:t>
+              <w:t>В</w:t>
             </w:r>
           </w:p>
         </w:tc>
@@ -5805,7 +5793,9 @@
             <w:insideV w:val="single" w:color="auto" w:sz="4" w:space="0"/>
           </w:tblBorders>
           <w:tblCellMar>
+            <w:top w:w="0" w:type="dxa"/>
             <w:left w:w="108" w:type="dxa"/>
+            <w:bottom w:w="0" w:type="dxa"/>
             <w:right w:w="108" w:type="dxa"/>
           </w:tblCellMar>
         </w:tblPrEx>
@@ -5838,14 +5828,77 @@
             <w:pPr>
               <w:bidi w:val="0"/>
               <w:rPr>
+                <w:rFonts w:hint="default"/>
                 <w:vertAlign w:val="baseline"/>
+                <w:lang w:val="ru-RU"/>
+              </w:rPr>
+            </w:pPr>
+            <w:r>
+              <w:rPr>
+                <w:rFonts w:hint="default"/>
+                <w:vertAlign w:val="baseline"/>
+                <w:lang w:val="ru-RU"/>
+              </w:rPr>
+              <w:t>160</w:t>
+            </w:r>
+          </w:p>
+        </w:tc>
+      </w:tr>
+      <w:tr>
+        <w:tblPrEx>
+          <w:tblBorders>
+            <w:top w:val="single" w:color="auto" w:sz="4" w:space="0"/>
+            <w:left w:val="single" w:color="auto" w:sz="4" w:space="0"/>
+            <w:bottom w:val="single" w:color="auto" w:sz="4" w:space="0"/>
+            <w:right w:val="single" w:color="auto" w:sz="4" w:space="0"/>
+            <w:insideH w:val="single" w:color="auto" w:sz="4" w:space="0"/>
+            <w:insideV w:val="single" w:color="auto" w:sz="4" w:space="0"/>
+          </w:tblBorders>
+        </w:tblPrEx>
+        <w:tc>
+          <w:tcPr>
+            <w:tcW w:w="4785" w:type="dxa"/>
+            <w:vAlign w:val="center"/>
+          </w:tcPr>
+          <w:p>
+            <w:pPr>
+              <w:bidi w:val="0"/>
+              <w:rPr>
+                <w:vertAlign w:val="baseline"/>
               </w:rPr>
             </w:pPr>
             <w:r>
               <w:rPr>
                 <w:lang w:val="en-US" w:eastAsia="zh-CN"/>
               </w:rPr>
-              <w:t>150 об/мин</w:t>
+              <w:t>Потребляемый ток (холостой режим)</w:t>
+            </w:r>
+          </w:p>
+        </w:tc>
+        <w:tc>
+          <w:tcPr>
+            <w:tcW w:w="4786" w:type="dxa"/>
+            <w:vAlign w:val="center"/>
+          </w:tcPr>
+          <w:p>
+            <w:pPr>
+              <w:bidi w:val="0"/>
+              <w:rPr>
+                <w:vertAlign w:val="baseline"/>
+              </w:rPr>
+            </w:pPr>
+            <w:r>
+              <w:rPr>
+                <w:rFonts w:hint="default"/>
+                <w:lang w:val="ru-RU" w:eastAsia="zh-CN"/>
+              </w:rPr>
+              <w:t>1</w:t>
+            </w:r>
+            <w:r>
+              <w:rPr>
+                <w:lang w:val="en-US" w:eastAsia="zh-CN"/>
+              </w:rPr>
+              <w:t xml:space="preserve"> А</w:t>
             </w:r>
           </w:p>
         </w:tc>
@@ -5861,7 +5914,9 @@
             <w:insideV w:val="single" w:color="auto" w:sz="4" w:space="0"/>
           </w:tblBorders>
           <w:tblCellMar>
+            <w:top w:w="0" w:type="dxa"/>
             <w:left w:w="108" w:type="dxa"/>
+            <w:bottom w:w="0" w:type="dxa"/>
             <w:right w:w="108" w:type="dxa"/>
           </w:tblCellMar>
         </w:tblPrEx>
@@ -5881,7 +5936,7 @@
               <w:rPr>
                 <w:lang w:val="en-US" w:eastAsia="zh-CN"/>
               </w:rPr>
-              <w:t>Потребляемый ток (холостой режим)</w:t>
+              <w:t>Скорость вращения (номинальный режим) (+-10%)</w:t>
             </w:r>
           </w:p>
         </w:tc>
@@ -5899,9 +5954,70 @@
             </w:pPr>
             <w:r>
               <w:rPr>
+                <w:rFonts w:hint="default"/>
+                <w:lang w:val="ru-RU" w:eastAsia="zh-CN"/>
+              </w:rPr>
+              <w:t>130</w:t>
+            </w:r>
+            <w:r>
+              <w:rPr>
                 <w:lang w:val="en-US" w:eastAsia="zh-CN"/>
               </w:rPr>
-              <w:t>0.1 А</w:t>
+              <w:t xml:space="preserve"> об/</w:t>
+            </w:r>
+            <w:r>
+              <w:rPr>
+                <w:rFonts w:hint="default" w:ascii="Times New Roman" w:hAnsi="Times New Roman" w:cs="Times New Roman"/>
+                <w:lang w:val="en-US" w:eastAsia="zh-CN"/>
+              </w:rPr>
+              <w:t>мин</w:t>
+            </w:r>
+            <w:r>
+              <w:rPr>
+                <w:rFonts w:hint="default" w:ascii="Times New Roman" w:hAnsi="Times New Roman" w:cs="Times New Roman"/>
+                <w:lang w:val="ru-RU" w:eastAsia="zh-CN"/>
+              </w:rPr>
+              <w:t xml:space="preserve"> </w:t>
+            </w:r>
+            <w:r>
+              <w:rPr>
+                <w:rFonts w:hint="default" w:ascii="Times New Roman" w:hAnsi="Times New Roman" w:cs="Times New Roman"/>
+                <w:b w:val="0"/>
+                <w:i w:val="0"/>
+                <w:sz w:val="24"/>
+                <w:lang w:val="en-US"/>
+              </w:rPr>
+              <w:t>≈</w:t>
+            </w:r>
+            <w:r>
+              <w:rPr>
+                <w:rFonts w:hint="default" w:ascii="Times New Roman" w:hAnsi="Times New Roman" w:cs="Times New Roman"/>
+                <w:b w:val="0"/>
+                <w:i w:val="0"/>
+                <w:sz w:val="24"/>
+                <w:lang w:val="ru-RU"/>
+              </w:rPr>
+              <w:t xml:space="preserve"> 0.81</w:t>
+            </w:r>
+            <w:r>
+              <w:rPr>
+                <w:rFonts w:hint="default" w:cs="Times New Roman"/>
+                <w:b w:val="0"/>
+                <w:i w:val="0"/>
+                <w:sz w:val="24"/>
+                <w:lang w:val="ru-RU"/>
+              </w:rPr>
+              <w:t>7</w:t>
+            </w:r>
+            <w:r>
+              <w:rPr>
+                <w:rFonts w:hint="default" w:ascii="Times New Roman" w:hAnsi="Times New Roman" w:cs="Times New Roman"/>
+                <w:b w:val="0"/>
+                <w:i w:val="0"/>
+                <w:sz w:val="24"/>
+                <w:lang w:val="ru-RU"/>
+              </w:rPr>
+              <w:t xml:space="preserve"> м/с</w:t>
             </w:r>
           </w:p>
         </w:tc>
@@ -5917,7 +6033,9 @@
             <w:insideV w:val="single" w:color="auto" w:sz="4" w:space="0"/>
           </w:tblBorders>
           <w:tblCellMar>
+            <w:top w:w="0" w:type="dxa"/>
             <w:left w:w="108" w:type="dxa"/>
+            <w:bottom w:w="0" w:type="dxa"/>
             <w:right w:w="108" w:type="dxa"/>
           </w:tblCellMar>
         </w:tblPrEx>
@@ -5937,7 +6055,7 @@
               <w:rPr>
                 <w:lang w:val="en-US" w:eastAsia="zh-CN"/>
               </w:rPr>
-              <w:t>Скорость вращения (номинальный режим) (+-10%)</w:t>
+              <w:t>Потребляемый ток (номинальный режим)</w:t>
             </w:r>
           </w:p>
         </w:tc>
@@ -5955,9 +6073,17 @@
             </w:pPr>
             <w:r>
               <w:rPr>
+                <w:rFonts w:hint="default"/>
+                <w:lang w:val="ru-RU" w:eastAsia="zh-CN"/>
+              </w:rPr>
+              <w:t>2.5</w:t>
+            </w:r>
+            <w:r>
+              <w:rPr>
+                <w:rFonts w:hint="default"/>
                 <w:lang w:val="en-US" w:eastAsia="zh-CN"/>
               </w:rPr>
-              <w:t>100 об/мин</w:t>
+              <w:t xml:space="preserve"> А</w:t>
             </w:r>
           </w:p>
         </w:tc>
@@ -5973,7 +6099,9 @@
             <w:insideV w:val="single" w:color="auto" w:sz="4" w:space="0"/>
           </w:tblBorders>
           <w:tblCellMar>
+            <w:top w:w="0" w:type="dxa"/>
             <w:left w:w="108" w:type="dxa"/>
+            <w:bottom w:w="0" w:type="dxa"/>
             <w:right w:w="108" w:type="dxa"/>
           </w:tblCellMar>
         </w:tblPrEx>
@@ -5993,7 +6121,7 @@
               <w:rPr>
                 <w:lang w:val="en-US" w:eastAsia="zh-CN"/>
               </w:rPr>
-              <w:t>Потребляемый ток (номинальный режим)</w:t>
+              <w:t>Крутящий момент (номинальный режим)</w:t>
             </w:r>
           </w:p>
         </w:tc>
@@ -6011,9 +6139,90 @@
             </w:pPr>
             <w:r>
               <w:rPr>
+                <w:rFonts w:hint="default"/>
+                <w:lang w:val="ru-RU" w:eastAsia="zh-CN"/>
+              </w:rPr>
+              <w:t>4.5</w:t>
+            </w:r>
+            <w:r>
+              <w:rPr>
                 <w:lang w:val="en-US" w:eastAsia="zh-CN"/>
               </w:rPr>
-              <w:t>0.4 А</w:t>
+              <w:t xml:space="preserve"> кг</w:t>
+            </w:r>
+            <w:r>
+              <w:rPr>
+                <w:rFonts w:ascii="Times New Roman" w:hAnsi="Times New Roman"/>
+                <w:b w:val="0"/>
+                <w:i w:val="0"/>
+                <w:sz w:val="24"/>
+              </w:rPr>
+              <w:t>·</w:t>
+            </w:r>
+            <w:r>
+              <w:rPr>
+                <w:lang w:val="en-US" w:eastAsia="zh-CN"/>
+              </w:rPr>
+              <w:t>см</w:t>
+            </w:r>
+          </w:p>
+        </w:tc>
+      </w:tr>
+      <w:tr>
+        <w:tblPrEx>
+          <w:tblBorders>
+            <w:top w:val="single" w:color="auto" w:sz="4" w:space="0"/>
+            <w:left w:val="single" w:color="auto" w:sz="4" w:space="0"/>
+            <w:bottom w:val="single" w:color="auto" w:sz="4" w:space="0"/>
+            <w:right w:val="single" w:color="auto" w:sz="4" w:space="0"/>
+            <w:insideH w:val="single" w:color="auto" w:sz="4" w:space="0"/>
+            <w:insideV w:val="single" w:color="auto" w:sz="4" w:space="0"/>
+          </w:tblBorders>
+        </w:tblPrEx>
+        <w:tc>
+          <w:tcPr>
+            <w:tcW w:w="4785" w:type="dxa"/>
+            <w:vAlign w:val="center"/>
+          </w:tcPr>
+          <w:p>
+            <w:pPr>
+              <w:bidi w:val="0"/>
+              <w:rPr>
+                <w:vertAlign w:val="baseline"/>
+              </w:rPr>
+            </w:pPr>
+            <w:r>
+              <w:rPr>
+                <w:lang w:val="en-US" w:eastAsia="zh-CN"/>
+              </w:rPr>
+              <w:t>Потребляемая мощность (номинальный режим)</w:t>
+            </w:r>
+          </w:p>
+        </w:tc>
+        <w:tc>
+          <w:tcPr>
+            <w:tcW w:w="4786" w:type="dxa"/>
+            <w:vAlign w:val="center"/>
+          </w:tcPr>
+          <w:p>
+            <w:pPr>
+              <w:bidi w:val="0"/>
+              <w:rPr>
+                <w:vertAlign w:val="baseline"/>
+              </w:rPr>
+            </w:pPr>
+            <w:r>
+              <w:rPr>
+                <w:rFonts w:hint="default"/>
+                <w:lang w:val="ru-RU" w:eastAsia="zh-CN"/>
+              </w:rPr>
+              <w:t>30</w:t>
+            </w:r>
+            <w:r>
+              <w:rPr>
+                <w:lang w:val="en-US" w:eastAsia="zh-CN"/>
+              </w:rPr>
+              <w:t xml:space="preserve"> Вт</w:t>
             </w:r>
           </w:p>
         </w:tc>
@@ -6029,7 +6238,9 @@
             <w:insideV w:val="single" w:color="auto" w:sz="4" w:space="0"/>
           </w:tblBorders>
           <w:tblCellMar>
+            <w:top w:w="0" w:type="dxa"/>
             <w:left w:w="108" w:type="dxa"/>
+            <w:bottom w:w="0" w:type="dxa"/>
             <w:right w:w="108" w:type="dxa"/>
           </w:tblCellMar>
         </w:tblPrEx>
@@ -6042,14 +6253,14 @@
             <w:pPr>
               <w:bidi w:val="0"/>
               <w:rPr>
-                <w:vertAlign w:val="baseline"/>
-              </w:rPr>
-            </w:pPr>
-            <w:r>
-              <w:rPr>
                 <w:lang w:val="en-US" w:eastAsia="zh-CN"/>
               </w:rPr>
-              <w:t>Крутящий момент (номинальный режим)</w:t>
+            </w:pPr>
+            <w:r>
+              <w:rPr>
+                <w:lang w:val="en-US" w:eastAsia="zh-CN"/>
+              </w:rPr>
+              <w:t>Крутящий момент (пусковой режим)</w:t>
             </w:r>
           </w:p>
         </w:tc>
@@ -6067,9 +6278,16 @@
             </w:pPr>
             <w:r>
               <w:rPr>
+                <w:rFonts w:hint="default"/>
+                <w:lang w:val="ru-RU" w:eastAsia="zh-CN"/>
+              </w:rPr>
+              <w:t>30</w:t>
+            </w:r>
+            <w:r>
+              <w:rPr>
                 <w:lang w:val="en-US" w:eastAsia="zh-CN"/>
               </w:rPr>
-              <w:t>1.2 кг</w:t>
+              <w:t xml:space="preserve"> кг</w:t>
             </w:r>
             <w:r>
               <w:rPr>
@@ -6100,7 +6318,9 @@
             <w:insideV w:val="single" w:color="auto" w:sz="4" w:space="0"/>
           </w:tblBorders>
           <w:tblCellMar>
+            <w:top w:w="0" w:type="dxa"/>
             <w:left w:w="108" w:type="dxa"/>
+            <w:bottom w:w="0" w:type="dxa"/>
             <w:right w:w="108" w:type="dxa"/>
           </w:tblCellMar>
         </w:tblPrEx>
@@ -6113,14 +6333,14 @@
             <w:pPr>
               <w:bidi w:val="0"/>
               <w:rPr>
-                <w:vertAlign w:val="baseline"/>
-              </w:rPr>
-            </w:pPr>
-            <w:r>
-              <w:rPr>
                 <w:lang w:val="en-US" w:eastAsia="zh-CN"/>
               </w:rPr>
-              <w:t>Потребляемая мощность (номинальный режим)</w:t>
+            </w:pPr>
+            <w:r>
+              <w:rPr>
+                <w:lang w:val="en-US" w:eastAsia="zh-CN"/>
+              </w:rPr>
+              <w:t>Потребляемый ток (пусковой режим)</w:t>
             </w:r>
           </w:p>
         </w:tc>
@@ -6138,9 +6358,16 @@
             </w:pPr>
             <w:r>
               <w:rPr>
+                <w:rFonts w:hint="default"/>
+                <w:lang w:val="ru-RU" w:eastAsia="zh-CN"/>
+              </w:rPr>
+              <w:t>6</w:t>
+            </w:r>
+            <w:r>
+              <w:rPr>
                 <w:lang w:val="en-US" w:eastAsia="zh-CN"/>
               </w:rPr>
-              <w:t>2.4 Вт</w:t>
+              <w:t xml:space="preserve"> А</w:t>
             </w:r>
           </w:p>
         </w:tc>
@@ -6156,7 +6383,9 @@
             <w:insideV w:val="single" w:color="auto" w:sz="4" w:space="0"/>
           </w:tblBorders>
           <w:tblCellMar>
+            <w:top w:w="0" w:type="dxa"/>
             <w:left w:w="108" w:type="dxa"/>
+            <w:bottom w:w="0" w:type="dxa"/>
             <w:right w:w="108" w:type="dxa"/>
           </w:tblCellMar>
         </w:tblPrEx>
@@ -6176,7 +6405,7 @@
               <w:rPr>
                 <w:lang w:val="en-US" w:eastAsia="zh-CN"/>
               </w:rPr>
-              <w:t>Крутящий момент (пусковой режим)</w:t>
+              <w:t>Масса</w:t>
             </w:r>
           </w:p>
         </w:tc>
@@ -6194,192 +6423,16 @@
             </w:pPr>
             <w:r>
               <w:rPr>
+                <w:rFonts w:hint="default"/>
+                <w:lang w:val="ru-RU" w:eastAsia="zh-CN"/>
+              </w:rPr>
+              <w:t>30</w:t>
+            </w:r>
+            <w:r>
+              <w:rPr>
                 <w:lang w:val="en-US" w:eastAsia="zh-CN"/>
               </w:rPr>
-              <w:t>4 кг</w:t>
-            </w:r>
-            <w:r>
-              <w:rPr>
-                <w:rFonts w:ascii="Times New Roman" w:hAnsi="Times New Roman"/>
-                <w:b w:val="0"/>
-                <w:i w:val="0"/>
-                <w:sz w:val="24"/>
-              </w:rPr>
-              <w:t>·</w:t>
-            </w:r>
-            <w:r>
-              <w:rPr>
-                <w:lang w:val="en-US" w:eastAsia="zh-CN"/>
-              </w:rPr>
-              <w:t>см</w:t>
-            </w:r>
-          </w:p>
-        </w:tc>
-      </w:tr>
-      <w:tr>
-        <w:tblPrEx>
-          <w:tblBorders>
-            <w:top w:val="single" w:color="auto" w:sz="4" w:space="0"/>
-            <w:left w:val="single" w:color="auto" w:sz="4" w:space="0"/>
-            <w:bottom w:val="single" w:color="auto" w:sz="4" w:space="0"/>
-            <w:right w:val="single" w:color="auto" w:sz="4" w:space="0"/>
-            <w:insideH w:val="single" w:color="auto" w:sz="4" w:space="0"/>
-            <w:insideV w:val="single" w:color="auto" w:sz="4" w:space="0"/>
-          </w:tblBorders>
-          <w:tblCellMar>
-            <w:left w:w="108" w:type="dxa"/>
-            <w:right w:w="108" w:type="dxa"/>
-          </w:tblCellMar>
-        </w:tblPrEx>
-        <w:tc>
-          <w:tcPr>
-            <w:tcW w:w="4785" w:type="dxa"/>
-            <w:vAlign w:val="center"/>
-          </w:tcPr>
-          <w:p>
-            <w:pPr>
-              <w:bidi w:val="0"/>
-              <w:rPr>
-                <w:lang w:val="en-US" w:eastAsia="zh-CN"/>
-              </w:rPr>
-            </w:pPr>
-            <w:r>
-              <w:rPr>
-                <w:lang w:val="en-US" w:eastAsia="zh-CN"/>
-              </w:rPr>
-              <w:t>Потребляемый ток (пусковой режим)</w:t>
-            </w:r>
-          </w:p>
-        </w:tc>
-        <w:tc>
-          <w:tcPr>
-            <w:tcW w:w="4786" w:type="dxa"/>
-            <w:vAlign w:val="center"/>
-          </w:tcPr>
-          <w:p>
-            <w:pPr>
-              <w:bidi w:val="0"/>
-              <w:rPr>
-                <w:vertAlign w:val="baseline"/>
-              </w:rPr>
-            </w:pPr>
-            <w:r>
-              <w:rPr>
-                <w:lang w:val="en-US" w:eastAsia="zh-CN"/>
-              </w:rPr>
-              <w:t>1.8 А</w:t>
-            </w:r>
-          </w:p>
-        </w:tc>
-      </w:tr>
-      <w:tr>
-        <w:tblPrEx>
-          <w:tblBorders>
-            <w:top w:val="single" w:color="auto" w:sz="4" w:space="0"/>
-            <w:left w:val="single" w:color="auto" w:sz="4" w:space="0"/>
-            <w:bottom w:val="single" w:color="auto" w:sz="4" w:space="0"/>
-            <w:right w:val="single" w:color="auto" w:sz="4" w:space="0"/>
-            <w:insideH w:val="single" w:color="auto" w:sz="4" w:space="0"/>
-            <w:insideV w:val="single" w:color="auto" w:sz="4" w:space="0"/>
-          </w:tblBorders>
-          <w:tblCellMar>
-            <w:left w:w="108" w:type="dxa"/>
-            <w:right w:w="108" w:type="dxa"/>
-          </w:tblCellMar>
-        </w:tblPrEx>
-        <w:tc>
-          <w:tcPr>
-            <w:tcW w:w="4785" w:type="dxa"/>
-            <w:vAlign w:val="center"/>
-          </w:tcPr>
-          <w:p>
-            <w:pPr>
-              <w:bidi w:val="0"/>
-              <w:rPr>
-                <w:lang w:val="en-US" w:eastAsia="zh-CN"/>
-              </w:rPr>
-            </w:pPr>
-            <w:r>
-              <w:rPr>
-                <w:lang w:val="en-US" w:eastAsia="zh-CN"/>
-              </w:rPr>
-              <w:t>Пороговое напряжение, после которого начинается движение</w:t>
-            </w:r>
-          </w:p>
-        </w:tc>
-        <w:tc>
-          <w:tcPr>
-            <w:tcW w:w="4786" w:type="dxa"/>
-            <w:vAlign w:val="center"/>
-          </w:tcPr>
-          <w:p>
-            <w:pPr>
-              <w:bidi w:val="0"/>
-              <w:rPr>
-                <w:vertAlign w:val="baseline"/>
-              </w:rPr>
-            </w:pPr>
-            <w:r>
-              <w:rPr>
-                <w:lang w:val="en-US" w:eastAsia="zh-CN"/>
-              </w:rPr>
-              <w:t>1 В</w:t>
-            </w:r>
-          </w:p>
-        </w:tc>
-      </w:tr>
-      <w:tr>
-        <w:tblPrEx>
-          <w:tblBorders>
-            <w:top w:val="single" w:color="auto" w:sz="4" w:space="0"/>
-            <w:left w:val="single" w:color="auto" w:sz="4" w:space="0"/>
-            <w:bottom w:val="single" w:color="auto" w:sz="4" w:space="0"/>
-            <w:right w:val="single" w:color="auto" w:sz="4" w:space="0"/>
-            <w:insideH w:val="single" w:color="auto" w:sz="4" w:space="0"/>
-            <w:insideV w:val="single" w:color="auto" w:sz="4" w:space="0"/>
-          </w:tblBorders>
-          <w:tblCellMar>
-            <w:left w:w="108" w:type="dxa"/>
-            <w:right w:w="108" w:type="dxa"/>
-          </w:tblCellMar>
-        </w:tblPrEx>
-        <w:tc>
-          <w:tcPr>
-            <w:tcW w:w="4785" w:type="dxa"/>
-            <w:vAlign w:val="center"/>
-          </w:tcPr>
-          <w:p>
-            <w:pPr>
-              <w:bidi w:val="0"/>
-              <w:rPr>
-                <w:lang w:val="en-US" w:eastAsia="zh-CN"/>
-              </w:rPr>
-            </w:pPr>
-            <w:r>
-              <w:rPr>
-                <w:lang w:val="en-US" w:eastAsia="zh-CN"/>
-              </w:rPr>
-              <w:t>Масса</w:t>
-            </w:r>
-          </w:p>
-        </w:tc>
-        <w:tc>
-          <w:tcPr>
-            <w:tcW w:w="4786" w:type="dxa"/>
-            <w:vAlign w:val="center"/>
-          </w:tcPr>
-          <w:p>
-            <w:pPr>
-              <w:bidi w:val="0"/>
-              <w:rPr>
-                <w:vertAlign w:val="baseline"/>
-              </w:rPr>
-            </w:pPr>
-            <w:r>
-              <w:rPr>
-                <w:lang w:val="en-US" w:eastAsia="zh-CN"/>
-              </w:rPr>
-              <w:t>160 г</w:t>
+              <w:t>0 г</w:t>
             </w:r>
           </w:p>
         </w:tc>
@@ -6387,6 +6440,59 @@
     </w:tbl>
     <w:p>
       <w:pPr>
+        <w:bidi w:val="0"/>
+      </w:pPr>
+    </w:p>
+    <w:p>
+      <w:pPr>
+        <w:bidi w:val="0"/>
+        <w:rPr>
+          <w:rFonts w:hint="default"/>
+          <w:lang w:val="ru-RU"/>
+        </w:rPr>
+      </w:pPr>
+      <w:r>
+        <w:rPr>
+          <w:lang w:val="ru-RU"/>
+        </w:rPr>
+        <w:t>Такие</w:t>
+      </w:r>
+      <w:r>
+        <w:rPr>
+          <w:rFonts w:hint="default"/>
+          <w:lang w:val="ru-RU"/>
+        </w:rPr>
+        <w:t xml:space="preserve"> моторы обеспечивают необходимый крутящий момент.</w:t>
+      </w:r>
+    </w:p>
+    <w:p>
+      <w:pPr>
+        <w:bidi w:val="0"/>
+        <w:rPr>
+          <w:rFonts w:hint="default"/>
+          <w:lang w:val="ru-RU"/>
+        </w:rPr>
+      </w:pPr>
+      <w:r>
+        <w:rPr>
+          <w:rFonts w:hint="default"/>
+          <w:lang w:val="ru-RU"/>
+        </w:rPr>
+        <w:t xml:space="preserve">После выбора двигателя </w:t>
+      </w:r>
+      <w:r>
+        <w:rPr>
+          <w:rFonts w:hint="default"/>
+          <w:b w:val="0"/>
+          <w:i w:val="0"/>
+          <w:sz w:val="24"/>
+          <w:lang w:val="ru-RU"/>
+        </w:rPr>
+        <w:t>P_эл_моторов = 60 Вт</w:t>
+      </w:r>
+    </w:p>
+    <w:p>
+      <w:pPr>
         <w:pStyle w:val="3"/>
         <w:bidi w:val="0"/>
       </w:pPr>
@@ -6395,70 +6501,187 @@
       </w:r>
     </w:p>
     <w:p>
-      <w:r>
-        <w:t xml:space="preserve">Необходимая энергия: E = P·t = </w:t>
-      </w:r>
-      <w:r>
-        <w:rPr>
-          <w:rFonts w:hint="default"/>
-          <w:lang w:val="ru-RU"/>
-        </w:rPr>
-        <w:t>2</w:t>
-      </w:r>
-      <w:r>
-        <w:rPr>
-          <w:rFonts w:ascii="Times New Roman" w:hAnsi="Times New Roman"/>
-          <w:b w:val="0"/>
-          <w:i w:val="0"/>
-          <w:sz w:val="24"/>
-        </w:rPr>
-        <w:t>·</w:t>
-      </w:r>
-      <w:r>
-        <w:rPr>
-          <w:rFonts w:hint="default"/>
-          <w:lang w:val="ru-RU"/>
-        </w:rPr>
-        <w:t>2.4</w:t>
-      </w:r>
-      <w:r>
-        <w:t xml:space="preserve"> Вт</w:t>
-      </w:r>
-      <w:r>
-        <w:rPr>
-          <w:rFonts w:ascii="Times New Roman" w:hAnsi="Times New Roman"/>
-          <w:b w:val="0"/>
-          <w:i w:val="0"/>
-          <w:sz w:val="24"/>
-        </w:rPr>
-        <w:t>·</w:t>
-      </w:r>
-      <w:r>
-        <w:rPr>
-          <w:rFonts w:hint="default"/>
-          <w:lang w:val="ru-RU"/>
-        </w:rPr>
-        <w:t>1</w:t>
-      </w:r>
-      <w:r>
-        <w:t xml:space="preserve"> ч = </w:t>
-      </w:r>
-      <w:r>
-        <w:rPr>
-          <w:rFonts w:hint="default"/>
-          <w:lang w:val="ru-RU"/>
-        </w:rPr>
-        <w:t>4.8</w:t>
-      </w:r>
-      <w:r>
-        <w:t xml:space="preserve"> Вт·ч</w:t>
-      </w:r>
-    </w:p>
-    <w:p/>
+      <w:pPr>
+        <w:spacing w:line="360" w:lineRule="auto"/>
+        <w:jc w:val="both"/>
+      </w:pPr>
+      <w:r>
+        <w:rPr>
+          <w:rFonts w:ascii="Times New Roman" w:hAnsi="Times New Roman"/>
+          <w:b w:val="0"/>
+          <w:i w:val="0"/>
+          <w:sz w:val="24"/>
+        </w:rPr>
+        <w:t>Суммарная потребляемая мощность</w:t>
+      </w:r>
+      <w:r>
+        <w:rPr>
+          <w:rFonts w:hint="default"/>
+          <w:b w:val="0"/>
+          <w:i w:val="0"/>
+          <w:sz w:val="24"/>
+          <w:lang w:val="ru-RU"/>
+        </w:rPr>
+        <w:t xml:space="preserve"> электрическая</w:t>
+      </w:r>
+      <w:r>
+        <w:rPr>
+          <w:rFonts w:ascii="Times New Roman" w:hAnsi="Times New Roman"/>
+          <w:b w:val="0"/>
+          <w:i w:val="0"/>
+          <w:sz w:val="24"/>
+        </w:rPr>
+        <w:t>: P</w:t>
+      </w:r>
+      <w:r>
+        <w:rPr>
+          <w:rFonts w:hint="default"/>
+          <w:b w:val="0"/>
+          <w:i w:val="0"/>
+          <w:sz w:val="24"/>
+          <w:lang w:val="ru-RU"/>
+        </w:rPr>
+        <w:t>_эл = P_эл_моторов + запас</w:t>
+      </w:r>
+      <w:r>
+        <w:rPr>
+          <w:rFonts w:ascii="Times New Roman" w:hAnsi="Times New Roman"/>
+          <w:b w:val="0"/>
+          <w:i w:val="0"/>
+          <w:sz w:val="24"/>
+        </w:rPr>
+        <w:t xml:space="preserve"> =</w:t>
+      </w:r>
+      <w:r>
+        <w:rPr>
+          <w:rFonts w:hint="default"/>
+          <w:b w:val="0"/>
+          <w:i w:val="0"/>
+          <w:sz w:val="24"/>
+          <w:lang w:val="en-US"/>
+        </w:rPr>
+        <w:t xml:space="preserve"> </w:t>
+      </w:r>
+      <w:r>
+        <w:rPr>
+          <w:rFonts w:hint="default"/>
+          <w:b w:val="0"/>
+          <w:i w:val="0"/>
+          <w:sz w:val="24"/>
+          <w:lang w:val="ru-RU"/>
+        </w:rPr>
+        <w:t>80</w:t>
+      </w:r>
+      <w:r>
+        <w:rPr>
+          <w:rFonts w:ascii="Times New Roman" w:hAnsi="Times New Roman"/>
+          <w:b w:val="0"/>
+          <w:i w:val="0"/>
+          <w:sz w:val="24"/>
+        </w:rPr>
+        <w:t xml:space="preserve"> Вт.</w:t>
+      </w:r>
+    </w:p>
+    <w:p>
+      <w:pPr>
+        <w:spacing w:line="360" w:lineRule="auto"/>
+        <w:jc w:val="both"/>
+        <w:rPr>
+          <w:rFonts w:hint="default"/>
+          <w:b w:val="0"/>
+          <w:i w:val="0"/>
+          <w:sz w:val="24"/>
+          <w:lang w:val="ru-RU"/>
+        </w:rPr>
+      </w:pPr>
+      <w:r>
+        <w:rPr>
+          <w:rFonts w:ascii="Times New Roman" w:hAnsi="Times New Roman"/>
+          <w:b w:val="0"/>
+          <w:i w:val="0"/>
+          <w:sz w:val="24"/>
+        </w:rPr>
+        <w:t xml:space="preserve">При времени работы 1 час от источника </w:t>
+      </w:r>
+      <w:r>
+        <w:rPr>
+          <w:rFonts w:hint="default"/>
+          <w:b w:val="0"/>
+          <w:i w:val="0"/>
+          <w:sz w:val="24"/>
+          <w:lang w:val="ru-RU"/>
+        </w:rPr>
+        <w:t>12</w:t>
+      </w:r>
+      <w:r>
+        <w:rPr>
+          <w:rFonts w:ascii="Times New Roman" w:hAnsi="Times New Roman"/>
+          <w:b w:val="0"/>
+          <w:i w:val="0"/>
+          <w:sz w:val="24"/>
+        </w:rPr>
+        <w:t xml:space="preserve"> В требуемая ёмкость аккумулятора: </w:t>
+      </w:r>
+      <w:r>
+        <w:rPr>
+          <w:rFonts w:hint="default"/>
+          <w:b w:val="0"/>
+          <w:i w:val="0"/>
+          <w:sz w:val="24"/>
+          <w:lang w:val="ru-RU"/>
+        </w:rPr>
+        <w:t xml:space="preserve">80 </w:t>
+      </w:r>
+      <w:r>
+        <w:rPr>
+          <w:rFonts w:ascii="Times New Roman" w:hAnsi="Times New Roman"/>
+          <w:b w:val="0"/>
+          <w:i w:val="0"/>
+          <w:sz w:val="24"/>
+        </w:rPr>
+        <w:t>Вт·ч</w:t>
+      </w:r>
+      <w:r>
+        <w:rPr>
+          <w:rFonts w:hint="default"/>
+          <w:b w:val="0"/>
+          <w:i w:val="0"/>
+          <w:sz w:val="24"/>
+          <w:lang w:val="ru-RU"/>
+        </w:rPr>
+        <w:t>.</w:t>
+      </w:r>
+    </w:p>
+    <w:p>
+      <w:pPr>
+        <w:spacing w:line="360" w:lineRule="auto"/>
+        <w:jc w:val="both"/>
+        <w:rPr>
+          <w:rFonts w:hint="default"/>
+          <w:b w:val="0"/>
+          <w:i w:val="0"/>
+          <w:sz w:val="24"/>
+          <w:lang w:val="ru-RU"/>
+        </w:rPr>
+      </w:pPr>
+    </w:p>
+    <w:p>
+      <w:pPr>
+        <w:spacing w:line="360" w:lineRule="auto"/>
+        <w:jc w:val="both"/>
+        <w:rPr>
+          <w:rFonts w:hint="default"/>
+          <w:b w:val="0"/>
+          <w:i w:val="0"/>
+          <w:sz w:val="24"/>
+          <w:lang w:val="ru-RU"/>
+        </w:rPr>
+      </w:pPr>
+    </w:p>
     <w:tbl>
       <w:tblPr>
-        <w:tblStyle w:val="21"/>
-        <w:tblW w:w="0" w:type="auto"/>
+        <w:tblStyle w:val="18"/>
+        <w:tblW w:w="4999" w:type="pct"/>
         <w:jc w:val="center"/>
         <w:tblBorders>
           <w:top w:val="single" w:color="auto" w:sz="4" w:space="0"/>
@@ -6477,10 +6700,9 @@
         </w:tblCellMar>
       </w:tblPr>
       <w:tblGrid>
-        <w:gridCol w:w="2391"/>
-        <w:gridCol w:w="2401"/>
-        <w:gridCol w:w="2383"/>
-        <w:gridCol w:w="2396"/>
+        <w:gridCol w:w="3192"/>
+        <w:gridCol w:w="3180"/>
+        <w:gridCol w:w="3197"/>
       </w:tblGrid>
       <w:tr>
         <w:tblPrEx>
@@ -6504,12 +6726,16 @@
         </w:trPr>
         <w:tc>
           <w:tcPr>
-            <w:tcW w:w="2391" w:type="dxa"/>
-          </w:tcPr>
-          <w:p>
-            <w:pPr>
-              <w:spacing w:after="0" w:line="240" w:lineRule="auto"/>
-              <w:jc w:val="center"/>
+            <w:tcW w:w="1667" w:type="pct"/>
+          </w:tcPr>
+          <w:p>
+            <w:pPr>
+              <w:spacing w:after="0" w:line="240" w:lineRule="auto"/>
+              <w:jc w:val="center"/>
+              <w:rPr>
+                <w:rFonts w:hint="default"/>
+                <w:lang w:val="ru-RU"/>
+              </w:rPr>
             </w:pPr>
             <w:r>
               <w:rPr>
@@ -6517,45 +6743,42 @@
               </w:rPr>
               <w:t>Напряжение</w:t>
             </w:r>
-          </w:p>
-        </w:tc>
-        <w:tc>
-          <w:tcPr>
-            <w:tcW w:w="2401" w:type="dxa"/>
-          </w:tcPr>
-          <w:p>
-            <w:pPr>
-              <w:spacing w:after="0" w:line="240" w:lineRule="auto"/>
-              <w:jc w:val="center"/>
-            </w:pPr>
-            <w:r>
-              <w:rPr>
+            <w:r>
+              <w:rPr>
+                <w:rFonts w:hint="default"/>
                 <w:b/>
-              </w:rPr>
-              <w:t>Минимум (теоретический)</w:t>
-            </w:r>
-          </w:p>
-        </w:tc>
-        <w:tc>
-          <w:tcPr>
-            <w:tcW w:w="2383" w:type="dxa"/>
-          </w:tcPr>
-          <w:p>
-            <w:pPr>
-              <w:spacing w:after="0" w:line="240" w:lineRule="auto"/>
-              <w:jc w:val="center"/>
+                <w:lang w:val="ru-RU"/>
+              </w:rPr>
+              <w:t xml:space="preserve"> аккумулятора</w:t>
+            </w:r>
+          </w:p>
+        </w:tc>
+        <w:tc>
+          <w:tcPr>
+            <w:tcW w:w="1661" w:type="pct"/>
+          </w:tcPr>
+          <w:p>
+            <w:pPr>
+              <w:spacing w:after="0" w:line="240" w:lineRule="auto"/>
+              <w:jc w:val="center"/>
+              <w:rPr>
+                <w:rFonts w:hint="default"/>
+                <w:lang w:val="ru-RU"/>
+              </w:rPr>
             </w:pPr>
             <w:r>
               <w:rPr>
                 <w:b/>
-              </w:rPr>
-              <w:t>Рекомендуемая (с запасом)</w:t>
-            </w:r>
-          </w:p>
-        </w:tc>
-        <w:tc>
-          <w:tcPr>
-            <w:tcW w:w="2396" w:type="dxa"/>
+                <w:bCs/>
+                <w:lang w:val="ru-RU"/>
+              </w:rPr>
+              <w:t>Ёмкость</w:t>
+            </w:r>
+          </w:p>
+        </w:tc>
+        <w:tc>
+          <w:tcPr>
+            <w:tcW w:w="1670" w:type="pct"/>
           </w:tcPr>
           <w:p>
             <w:pPr>
@@ -6593,45 +6816,28 @@
         </w:trPr>
         <w:tc>
           <w:tcPr>
-            <w:tcW w:w="2391" w:type="dxa"/>
-          </w:tcPr>
-          <w:p>
-            <w:pPr>
-              <w:spacing w:after="0" w:line="240" w:lineRule="auto"/>
-              <w:jc w:val="center"/>
-            </w:pPr>
-            <w:r>
-              <w:t>12 В</w:t>
-            </w:r>
-          </w:p>
-        </w:tc>
-        <w:tc>
-          <w:tcPr>
-            <w:tcW w:w="2401" w:type="dxa"/>
-          </w:tcPr>
-          <w:p>
-            <w:pPr>
-              <w:spacing w:after="0" w:line="240" w:lineRule="auto"/>
-              <w:jc w:val="center"/>
-            </w:pPr>
-            <w:r>
-              <w:t>0.</w:t>
-            </w:r>
+            <w:tcW w:w="1667" w:type="pct"/>
+          </w:tcPr>
+          <w:p>
+            <w:pPr>
+              <w:spacing w:after="0" w:line="240" w:lineRule="auto"/>
+              <w:jc w:val="center"/>
+            </w:pPr>
             <w:r>
               <w:rPr>
                 <w:rFonts w:hint="default"/>
                 <w:lang w:val="ru-RU"/>
               </w:rPr>
-              <w:t>4</w:t>
-            </w:r>
-            <w:r>
-              <w:t xml:space="preserve"> А·ч</w:t>
-            </w:r>
-          </w:p>
-        </w:tc>
-        <w:tc>
-          <w:tcPr>
-            <w:tcW w:w="2383" w:type="dxa"/>
+              <w:t>3.7</w:t>
+            </w:r>
+            <w:r>
+              <w:t xml:space="preserve"> В</w:t>
+            </w:r>
+          </w:p>
+        </w:tc>
+        <w:tc>
+          <w:tcPr>
+            <w:tcW w:w="1661" w:type="pct"/>
           </w:tcPr>
           <w:p>
             <w:pPr>
@@ -6643,7 +6849,7 @@
                 <w:rFonts w:hint="default"/>
                 <w:lang w:val="ru-RU"/>
               </w:rPr>
-              <w:t>2.5</w:t>
+              <w:t>3</w:t>
             </w:r>
             <w:r>
               <w:t xml:space="preserve"> А·ч</w:t>
@@ -6652,7 +6858,7 @@
         </w:tc>
         <w:tc>
           <w:tcPr>
-            <w:tcW w:w="2396" w:type="dxa"/>
+            <w:tcW w:w="1670" w:type="pct"/>
           </w:tcPr>
           <w:p>
             <w:pPr>
@@ -6666,32 +6872,122 @@
         </w:tc>
       </w:tr>
     </w:tbl>
-    <w:p/>
-    <w:p>
-      <w:r>
-        <w:t>Формула пересчёта: А·ч = E(Вт·ч) / Напряжение(В)</w:t>
-      </w:r>
-    </w:p>
-    <w:p>
-      <w:pPr>
-        <w:rPr>
-          <w:rFonts w:hint="default"/>
-          <w:lang w:val="ru-RU"/>
-        </w:rPr>
-      </w:pPr>
-    </w:p>
-    <w:p>
-      <w:pPr>
-        <w:spacing w:line="360" w:lineRule="auto"/>
-        <w:ind w:firstLine="567"/>
-        <w:jc w:val="both"/>
-        <w:rPr>
-          <w:rFonts w:ascii="Times New Roman" w:hAnsi="Times New Roman"/>
-          <w:b w:val="0"/>
-          <w:i w:val="0"/>
-          <w:sz w:val="24"/>
-        </w:rPr>
-      </w:pPr>
+    <w:p>
+      <w:pPr>
+        <w:rPr>
+          <w:rFonts w:hint="default"/>
+          <w:lang w:val="ru-RU"/>
+        </w:rPr>
+      </w:pPr>
+    </w:p>
+    <w:p>
+      <w:pPr>
+        <w:rPr>
+          <w:rFonts w:hint="default"/>
+          <w:b w:val="0"/>
+          <w:i w:val="0"/>
+          <w:sz w:val="24"/>
+          <w:lang w:val="ru-RU"/>
+        </w:rPr>
+      </w:pPr>
+      <w:r>
+        <w:rPr>
+          <w:rFonts w:hint="default"/>
+          <w:lang w:val="ru-RU"/>
+        </w:rPr>
+        <w:t>Ёмкость батареи в Вт</w:t>
+      </w:r>
+      <w:r>
+        <w:rPr>
+          <w:rFonts w:ascii="Times New Roman" w:hAnsi="Times New Roman"/>
+          <w:b w:val="0"/>
+          <w:i w:val="0"/>
+          <w:sz w:val="24"/>
+        </w:rPr>
+        <w:t>·ч</w:t>
+      </w:r>
+      <w:r>
+        <w:rPr>
+          <w:rFonts w:hint="default"/>
+          <w:b w:val="0"/>
+          <w:i w:val="0"/>
+          <w:sz w:val="24"/>
+          <w:lang w:val="ru-RU"/>
+        </w:rPr>
+        <w:t xml:space="preserve"> = 3.7 В · 3 А·ч = 11.1 Вт·ч.</w:t>
+      </w:r>
+    </w:p>
+    <w:p>
+      <w:pPr>
+        <w:rPr>
+          <w:rFonts w:hint="default"/>
+          <w:b w:val="0"/>
+          <w:i w:val="0"/>
+          <w:sz w:val="24"/>
+          <w:lang w:val="ru-RU"/>
+        </w:rPr>
+      </w:pPr>
+      <w:r>
+        <w:rPr>
+          <w:rFonts w:hint="default"/>
+          <w:b w:val="0"/>
+          <w:i w:val="0"/>
+          <w:sz w:val="24"/>
+          <w:lang w:val="ru-RU"/>
+        </w:rPr>
+        <w:t>Исходя из требуемой мощности нужно как минимум 8 аккумулятора, но с запасом лучше 9.</w:t>
+      </w:r>
+    </w:p>
+    <w:p>
+      <w:pPr>
+        <w:rPr>
+          <w:rFonts w:hint="default"/>
+          <w:b w:val="0"/>
+          <w:i w:val="0"/>
+          <w:sz w:val="24"/>
+          <w:lang w:val="ru-RU"/>
+        </w:rPr>
+      </w:pPr>
+      <w:r>
+        <w:rPr>
+          <w:rFonts w:hint="default"/>
+          <w:b w:val="0"/>
+          <w:i w:val="0"/>
+          <w:sz w:val="24"/>
+          <w:lang w:val="ru-RU"/>
+        </w:rPr>
+        <w:t xml:space="preserve">Масса 9 аккумуляторов = 55 г · 9 = 495 г </w:t>
+      </w:r>
+      <w:r>
+        <w:rPr>
+          <w:rFonts w:hint="default" w:ascii="Times New Roman" w:hAnsi="Times New Roman" w:cs="Times New Roman"/>
+          <w:b w:val="0"/>
+          <w:i w:val="0"/>
+          <w:sz w:val="24"/>
+          <w:lang w:val="en-US"/>
+        </w:rPr>
+        <w:t>≈</w:t>
+      </w:r>
+      <w:r>
+        <w:rPr>
+          <w:rFonts w:hint="default" w:ascii="Times New Roman" w:hAnsi="Times New Roman" w:cs="Times New Roman"/>
+          <w:b w:val="0"/>
+          <w:i w:val="0"/>
+          <w:sz w:val="24"/>
+          <w:lang w:val="ru-RU"/>
+        </w:rPr>
+        <w:t xml:space="preserve"> </w:t>
+      </w:r>
+      <w:r>
+        <w:rPr>
+          <w:rFonts w:hint="default" w:cs="Times New Roman"/>
+          <w:b w:val="0"/>
+          <w:i w:val="0"/>
+          <w:sz w:val="24"/>
+          <w:lang w:val="ru-RU"/>
+        </w:rPr>
+        <w:t>0.5 кг.</w:t>
+      </w:r>
     </w:p>
     <w:p>
       <w:pPr>
@@ -6716,7 +7012,7 @@
     </w:p>
     <w:tbl>
       <w:tblPr>
-        <w:tblStyle w:val="21"/>
+        <w:tblStyle w:val="18"/>
         <w:tblW w:w="0" w:type="auto"/>
         <w:jc w:val="center"/>
         <w:tblBorders>
@@ -6784,12 +7080,18 @@
             <w:pPr>
               <w:spacing w:after="0" w:line="240" w:lineRule="auto"/>
               <w:jc w:val="center"/>
-            </w:pPr>
-            <w:r>
-              <w:rPr>
+              <w:rPr>
+                <w:rFonts w:hint="default"/>
+                <w:lang w:val="ru-RU"/>
+              </w:rPr>
+            </w:pPr>
+            <w:r>
+              <w:rPr>
+                <w:rFonts w:hint="default"/>
                 <w:sz w:val="22"/>
-              </w:rPr>
-              <w:t>8.888</w:t>
+                <w:lang w:val="ru-RU"/>
+              </w:rPr>
+              <w:t>14</w:t>
             </w:r>
           </w:p>
         </w:tc>
@@ -6914,12 +7216,6 @@
             <w:insideH w:val="single" w:color="auto" w:sz="4" w:space="0"/>
             <w:insideV w:val="single" w:color="auto" w:sz="4" w:space="0"/>
           </w:tblBorders>
-          <w:tblCellMar>
-            <w:top w:w="0" w:type="dxa"/>
-            <w:left w:w="108" w:type="dxa"/>
-            <w:bottom w:w="0" w:type="dxa"/>
-            <w:right w:w="108" w:type="dxa"/>
-          </w:tblCellMar>
         </w:tblPrEx>
         <w:trPr>
           <w:jc w:val="center"/>
@@ -6971,7 +7267,7 @@
     </w:p>
     <w:tbl>
       <w:tblPr>
-        <w:tblStyle w:val="21"/>
+        <w:tblStyle w:val="18"/>
         <w:tblW w:w="0" w:type="auto"/>
         <w:jc w:val="center"/>
         <w:tblBorders>
@@ -7059,12 +7355,6 @@
             <w:insideH w:val="single" w:color="auto" w:sz="4" w:space="0"/>
             <w:insideV w:val="single" w:color="auto" w:sz="4" w:space="0"/>
           </w:tblBorders>
-          <w:tblCellMar>
-            <w:top w:w="0" w:type="dxa"/>
-            <w:left w:w="108" w:type="dxa"/>
-            <w:bottom w:w="0" w:type="dxa"/>
-            <w:right w:w="108" w:type="dxa"/>
-          </w:tblCellMar>
         </w:tblPrEx>
         <w:trPr>
           <w:jc w:val="center"/>
@@ -7169,12 +7459,6 @@
             <w:insideH w:val="single" w:color="auto" w:sz="4" w:space="0"/>
             <w:insideV w:val="single" w:color="auto" w:sz="4" w:space="0"/>
           </w:tblBorders>
-          <w:tblCellMar>
-            <w:top w:w="0" w:type="dxa"/>
-            <w:left w:w="108" w:type="dxa"/>
-            <w:bottom w:w="0" w:type="dxa"/>
-            <w:right w:w="108" w:type="dxa"/>
-          </w:tblCellMar>
         </w:tblPrEx>
         <w:trPr>
           <w:jc w:val="center"/>
@@ -7281,7 +7565,7 @@
     </w:p>
     <w:tbl>
       <w:tblPr>
-        <w:tblStyle w:val="21"/>
+        <w:tblStyle w:val="18"/>
         <w:tblW w:w="0" w:type="auto"/>
         <w:jc w:val="center"/>
         <w:tblBorders>
@@ -7479,12 +7763,6 @@
             <w:insideH w:val="single" w:color="auto" w:sz="4" w:space="0"/>
             <w:insideV w:val="single" w:color="auto" w:sz="4" w:space="0"/>
           </w:tblBorders>
-          <w:tblCellMar>
-            <w:top w:w="0" w:type="dxa"/>
-            <w:left w:w="108" w:type="dxa"/>
-            <w:bottom w:w="0" w:type="dxa"/>
-            <w:right w:w="108" w:type="dxa"/>
-          </w:tblCellMar>
         </w:tblPrEx>
         <w:trPr>
           <w:jc w:val="center"/>
@@ -7699,12 +7977,6 @@
             <w:insideH w:val="single" w:color="auto" w:sz="4" w:space="0"/>
             <w:insideV w:val="single" w:color="auto" w:sz="4" w:space="0"/>
           </w:tblBorders>
-          <w:tblCellMar>
-            <w:top w:w="0" w:type="dxa"/>
-            <w:left w:w="108" w:type="dxa"/>
-            <w:bottom w:w="0" w:type="dxa"/>
-            <w:right w:w="108" w:type="dxa"/>
-          </w:tblCellMar>
         </w:tblPrEx>
         <w:trPr>
           <w:jc w:val="center"/>
@@ -7919,12 +8191,6 @@
             <w:insideH w:val="single" w:color="auto" w:sz="4" w:space="0"/>
             <w:insideV w:val="single" w:color="auto" w:sz="4" w:space="0"/>
           </w:tblBorders>
-          <w:tblCellMar>
-            <w:top w:w="0" w:type="dxa"/>
-            <w:left w:w="108" w:type="dxa"/>
-            <w:bottom w:w="0" w:type="dxa"/>
-            <w:right w:w="108" w:type="dxa"/>
-          </w:tblCellMar>
         </w:tblPrEx>
         <w:trPr>
           <w:jc w:val="center"/>
@@ -8139,12 +8405,6 @@
             <w:insideH w:val="single" w:color="auto" w:sz="4" w:space="0"/>
             <w:insideV w:val="single" w:color="auto" w:sz="4" w:space="0"/>
           </w:tblBorders>
-          <w:tblCellMar>
-            <w:top w:w="0" w:type="dxa"/>
-            <w:left w:w="108" w:type="dxa"/>
-            <w:bottom w:w="0" w:type="dxa"/>
-            <w:right w:w="108" w:type="dxa"/>
-          </w:tblCellMar>
         </w:tblPrEx>
         <w:trPr>
           <w:jc w:val="center"/>
@@ -8185,7 +8445,11 @@
         </w:tc>
       </w:tr>
     </w:tbl>
-    <w:p/>
+    <w:p>
+      <w:r>
+        <w:br w:type="page"/>
+      </w:r>
+    </w:p>
     <w:p>
       <w:pPr>
         <w:bidi w:val="0"/>
@@ -8196,7 +8460,7 @@
     </w:p>
     <w:tbl>
       <w:tblPr>
-        <w:tblStyle w:val="21"/>
+        <w:tblStyle w:val="18"/>
         <w:tblW w:w="0" w:type="auto"/>
         <w:jc w:val="center"/>
         <w:tblBorders>
@@ -8229,6 +8493,12 @@
             <w:insideH w:val="single" w:color="auto" w:sz="4" w:space="0"/>
             <w:insideV w:val="single" w:color="auto" w:sz="4" w:space="0"/>
           </w:tblBorders>
+          <w:tblCellMar>
+            <w:top w:w="0" w:type="dxa"/>
+            <w:left w:w="108" w:type="dxa"/>
+            <w:bottom w:w="0" w:type="dxa"/>
+            <w:right w:w="108" w:type="dxa"/>
+          </w:tblCellMar>
         </w:tblPrEx>
         <w:trPr>
           <w:jc w:val="center"/>
@@ -8388,12 +8658,6 @@
             <w:insideH w:val="single" w:color="auto" w:sz="4" w:space="0"/>
             <w:insideV w:val="single" w:color="auto" w:sz="4" w:space="0"/>
           </w:tblBorders>
-          <w:tblCellMar>
-            <w:top w:w="0" w:type="dxa"/>
-            <w:left w:w="108" w:type="dxa"/>
-            <w:bottom w:w="0" w:type="dxa"/>
-            <w:right w:w="108" w:type="dxa"/>
-          </w:tblCellMar>
         </w:tblPrEx>
         <w:trPr>
           <w:jc w:val="center"/>
@@ -8608,12 +8872,6 @@
             <w:insideH w:val="single" w:color="auto" w:sz="4" w:space="0"/>
             <w:insideV w:val="single" w:color="auto" w:sz="4" w:space="0"/>
           </w:tblBorders>
-          <w:tblCellMar>
-            <w:top w:w="0" w:type="dxa"/>
-            <w:left w:w="108" w:type="dxa"/>
-            <w:bottom w:w="0" w:type="dxa"/>
-            <w:right w:w="108" w:type="dxa"/>
-          </w:tblCellMar>
         </w:tblPrEx>
         <w:trPr>
           <w:jc w:val="center"/>
@@ -8828,12 +9086,6 @@
             <w:insideH w:val="single" w:color="auto" w:sz="4" w:space="0"/>
             <w:insideV w:val="single" w:color="auto" w:sz="4" w:space="0"/>
           </w:tblBorders>
-          <w:tblCellMar>
-            <w:top w:w="0" w:type="dxa"/>
-            <w:left w:w="108" w:type="dxa"/>
-            <w:bottom w:w="0" w:type="dxa"/>
-            <w:right w:w="108" w:type="dxa"/>
-          </w:tblCellMar>
         </w:tblPrEx>
         <w:trPr>
           <w:jc w:val="center"/>
@@ -9048,12 +9300,6 @@
             <w:insideH w:val="single" w:color="auto" w:sz="4" w:space="0"/>
             <w:insideV w:val="single" w:color="auto" w:sz="4" w:space="0"/>
           </w:tblBorders>
-          <w:tblCellMar>
-            <w:top w:w="0" w:type="dxa"/>
-            <w:left w:w="108" w:type="dxa"/>
-            <w:bottom w:w="0" w:type="dxa"/>
-            <w:right w:w="108" w:type="dxa"/>
-          </w:tblCellMar>
         </w:tblPrEx>
         <w:trPr>
           <w:jc w:val="center"/>
@@ -9268,12 +9514,6 @@
             <w:insideH w:val="single" w:color="auto" w:sz="4" w:space="0"/>
             <w:insideV w:val="single" w:color="auto" w:sz="4" w:space="0"/>
           </w:tblBorders>
-          <w:tblCellMar>
-            <w:top w:w="0" w:type="dxa"/>
-            <w:left w:w="108" w:type="dxa"/>
-            <w:bottom w:w="0" w:type="dxa"/>
-            <w:right w:w="108" w:type="dxa"/>
-          </w:tblCellMar>
         </w:tblPrEx>
         <w:trPr>
           <w:jc w:val="center"/>
@@ -9488,12 +9728,6 @@
             <w:insideH w:val="single" w:color="auto" w:sz="4" w:space="0"/>
             <w:insideV w:val="single" w:color="auto" w:sz="4" w:space="0"/>
           </w:tblBorders>
-          <w:tblCellMar>
-            <w:top w:w="0" w:type="dxa"/>
-            <w:left w:w="108" w:type="dxa"/>
-            <w:bottom w:w="0" w:type="dxa"/>
-            <w:right w:w="108" w:type="dxa"/>
-          </w:tblCellMar>
         </w:tblPrEx>
         <w:trPr>
           <w:jc w:val="center"/>
@@ -9708,12 +9942,6 @@
             <w:insideH w:val="single" w:color="auto" w:sz="4" w:space="0"/>
             <w:insideV w:val="single" w:color="auto" w:sz="4" w:space="0"/>
           </w:tblBorders>
-          <w:tblCellMar>
-            <w:top w:w="0" w:type="dxa"/>
-            <w:left w:w="108" w:type="dxa"/>
-            <w:bottom w:w="0" w:type="dxa"/>
-            <w:right w:w="108" w:type="dxa"/>
-          </w:tblCellMar>
         </w:tblPrEx>
         <w:trPr>
           <w:jc w:val="center"/>
@@ -9928,12 +10156,6 @@
             <w:insideH w:val="single" w:color="auto" w:sz="4" w:space="0"/>
             <w:insideV w:val="single" w:color="auto" w:sz="4" w:space="0"/>
           </w:tblBorders>
-          <w:tblCellMar>
-            <w:top w:w="0" w:type="dxa"/>
-            <w:left w:w="108" w:type="dxa"/>
-            <w:bottom w:w="0" w:type="dxa"/>
-            <w:right w:w="108" w:type="dxa"/>
-          </w:tblCellMar>
         </w:tblPrEx>
         <w:trPr>
           <w:jc w:val="center"/>
@@ -10148,12 +10370,6 @@
             <w:insideH w:val="single" w:color="auto" w:sz="4" w:space="0"/>
             <w:insideV w:val="single" w:color="auto" w:sz="4" w:space="0"/>
           </w:tblBorders>
-          <w:tblCellMar>
-            <w:top w:w="0" w:type="dxa"/>
-            <w:left w:w="108" w:type="dxa"/>
-            <w:bottom w:w="0" w:type="dxa"/>
-            <w:right w:w="108" w:type="dxa"/>
-          </w:tblCellMar>
         </w:tblPrEx>
         <w:trPr>
           <w:jc w:val="center"/>
@@ -10262,15 +10478,11 @@
         </w:rPr>
       </w:pPr>
       <w:r>
-        <w:rPr>
-          <w:rFonts w:hint="default"/>
-          <w:lang w:val="ru-RU"/>
-        </w:rPr>
         <w:drawing>
           <wp:inline distT="0" distB="0" distL="114300" distR="114300">
-            <wp:extent cx="5937885" cy="4060190"/>
-            <wp:effectExtent l="0" t="0" r="5715" b="8890"/>
-            <wp:docPr id="4" name="Изображение 4" descr="Screenshot from 2026-04-19 22-27-26"/>
+            <wp:extent cx="6115050" cy="4181475"/>
+            <wp:effectExtent l="0" t="0" r="0" b="9525"/>
+            <wp:docPr id="4" name="Picture 2"/>
             <wp:cNvGraphicFramePr>
               <a:graphicFrameLocks xmlns:a="http://schemas.openxmlformats.org/drawingml/2006/main" noChangeAspect="1"/>
             </wp:cNvGraphicFramePr>
@@ -10278,7 +10490,7 @@
               <a:graphicData uri="http://schemas.openxmlformats.org/drawingml/2006/picture">
                 <pic:pic xmlns:pic="http://schemas.openxmlformats.org/drawingml/2006/picture">
                   <pic:nvPicPr>
-                    <pic:cNvPr id="4" name="Изображение 4" descr="Screenshot from 2026-04-19 22-27-26"/>
+                    <pic:cNvPr id="4" name="Picture 2"/>
                     <pic:cNvPicPr>
                       <a:picLocks noChangeAspect="1"/>
                     </pic:cNvPicPr>
@@ -10292,11 +10504,15 @@
                   <pic:spPr>
                     <a:xfrm>
                       <a:off x="0" y="0"/>
-                      <a:ext cx="5937885" cy="4060190"/>
+                      <a:ext cx="6115050" cy="4181475"/>
                     </a:xfrm>
                     <a:prstGeom prst="rect">
                       <a:avLst/>
                     </a:prstGeom>
+                    <a:noFill/>
+                    <a:ln>
+                      <a:noFill/>
+                    </a:ln>
                   </pic:spPr>
                 </pic:pic>
               </a:graphicData>
@@ -10304,48 +10520,48 @@
           </wp:inline>
         </w:drawing>
       </w:r>
-    </w:p>
-    <w:p>
-      <w:pPr>
-        <w:pStyle w:val="10"/>
-        <w:rPr>
-          <w:rFonts w:hint="default"/>
-          <w:lang w:val="ru-RU"/>
-        </w:rPr>
-      </w:pPr>
-      <w:r>
-        <w:t xml:space="preserve">Рисунок </w:t>
-      </w:r>
-      <w:r>
-        <w:fldChar w:fldCharType="begin"/>
-      </w:r>
-      <w:r>
-        <w:instrText xml:space="preserve"> SEQ Рисунок \* ARABIC </w:instrText>
-      </w:r>
-      <w:r>
-        <w:fldChar w:fldCharType="separate"/>
-      </w:r>
-      <w:r>
-        <w:t>2</w:t>
-      </w:r>
-      <w:r>
-        <w:fldChar w:fldCharType="end"/>
-      </w:r>
-      <w:r>
-        <w:rPr>
-          <w:lang w:val="ru-RU"/>
-        </w:rPr>
-        <w:t xml:space="preserve"> - Параметры платформы</w:t>
-      </w:r>
-      <w:r>
-        <w:rPr>
-          <w:rFonts w:hint="default"/>
-          <w:lang w:val="ru-RU"/>
-        </w:rPr>
-        <w:t>.</w:t>
-      </w:r>
       <w:bookmarkStart w:id="0" w:name="_GoBack"/>
       <w:bookmarkEnd w:id="0"/>
+    </w:p>
+    <w:p>
+      <w:pPr>
+        <w:pStyle w:val="9"/>
+        <w:rPr>
+          <w:rFonts w:hint="default"/>
+          <w:lang w:val="ru-RU"/>
+        </w:rPr>
+      </w:pPr>
+      <w:r>
+        <w:t xml:space="preserve">Рисунок </w:t>
+      </w:r>
+      <w:r>
+        <w:fldChar w:fldCharType="begin"/>
+      </w:r>
+      <w:r>
+        <w:instrText xml:space="preserve"> SEQ Рисунок \* ARABIC </w:instrText>
+      </w:r>
+      <w:r>
+        <w:fldChar w:fldCharType="separate"/>
+      </w:r>
+      <w:r>
+        <w:t>2</w:t>
+      </w:r>
+      <w:r>
+        <w:fldChar w:fldCharType="end"/>
+      </w:r>
+      <w:r>
+        <w:rPr>
+          <w:lang w:val="ru-RU"/>
+        </w:rPr>
+        <w:t xml:space="preserve"> - Параметры платформы</w:t>
+      </w:r>
+      <w:r>
+        <w:rPr>
+          <w:rFonts w:hint="default"/>
+          <w:lang w:val="ru-RU"/>
+        </w:rPr>
+        <w:t>.</w:t>
+      </w:r>
     </w:p>
     <w:p>
       <w:pPr>
@@ -10408,7 +10624,7 @@
     </w:p>
     <w:p>
       <w:pPr>
-        <w:pStyle w:val="10"/>
+        <w:pStyle w:val="9"/>
         <w:rPr>
           <w:rFonts w:hint="default"/>
           <w:lang w:val="ru-RU"/>
@@ -10507,7 +10723,7 @@
     </w:p>
     <w:p>
       <w:pPr>
-        <w:pStyle w:val="10"/>
+        <w:pStyle w:val="9"/>
         <w:rPr>
           <w:rFonts w:hint="default"/>
           <w:lang w:val="ru-RU"/>
@@ -10643,7 +10859,7 @@
     </w:p>
     <w:p>
       <w:pPr>
-        <w:pStyle w:val="10"/>
+        <w:pStyle w:val="9"/>
         <w:rPr>
           <w:rFonts w:hint="default"/>
           <w:lang w:val="ru-RU"/>
@@ -10761,7 +10977,7 @@
   <w:footnote w:type="separator" w:id="0">
     <w:p>
       <w:pPr>
-        <w:spacing w:before="0" w:after="0" w:line="240" w:lineRule="auto"/>
+        <w:spacing w:before="0" w:after="0" w:line="360" w:lineRule="auto"/>
       </w:pPr>
       <w:r>
         <w:separator/>
@@ -10771,7 +10987,7 @@
   <w:footnote w:type="continuationSeparator" w:id="1">
     <w:p>
       <w:pPr>
-        <w:spacing w:before="0" w:after="0" w:line="240" w:lineRule="auto"/>
+        <w:spacing w:before="0" w:after="0" w:line="360" w:lineRule="auto"/>
       </w:pPr>
       <w:r>
         <w:continuationSeparator/>
@@ -11038,14 +11254,112 @@
     <w:lsdException w:qFormat="1" w:uiPriority="99" w:name="Balloon Text"/>
     <w:lsdException w:qFormat="1" w:unhideWhenUsed="0" w:uiPriority="59" w:semiHidden="0" w:name="Table Grid"/>
     <w:lsdException w:uiPriority="99" w:name="Table Theme"/>
+    <w:lsdException w:unhideWhenUsed="0" w:uiPriority="60" w:semiHidden="0" w:name="Light Shading"/>
+    <w:lsdException w:unhideWhenUsed="0" w:uiPriority="61" w:semiHidden="0" w:name="Light List"/>
+    <w:lsdException w:unhideWhenUsed="0" w:uiPriority="62" w:semiHidden="0" w:name="Light Grid"/>
+    <w:lsdException w:unhideWhenUsed="0" w:uiPriority="63" w:semiHidden="0" w:name="Medium Shading 1"/>
+    <w:lsdException w:unhideWhenUsed="0" w:uiPriority="64" w:semiHidden="0" w:name="Medium Shading 2"/>
+    <w:lsdException w:unhideWhenUsed="0" w:uiPriority="65" w:semiHidden="0" w:name="Medium List 1"/>
+    <w:lsdException w:unhideWhenUsed="0" w:uiPriority="66" w:semiHidden="0" w:name="Medium List 2"/>
+    <w:lsdException w:unhideWhenUsed="0" w:uiPriority="67" w:semiHidden="0" w:name="Medium Grid 1"/>
+    <w:lsdException w:unhideWhenUsed="0" w:uiPriority="68" w:semiHidden="0" w:name="Medium Grid 2"/>
+    <w:lsdException w:unhideWhenUsed="0" w:uiPriority="69" w:semiHidden="0" w:name="Medium Grid 3"/>
+    <w:lsdException w:unhideWhenUsed="0" w:uiPriority="70" w:semiHidden="0" w:name="Dark List"/>
+    <w:lsdException w:unhideWhenUsed="0" w:uiPriority="71" w:semiHidden="0" w:name="Colorful Shading"/>
+    <w:lsdException w:unhideWhenUsed="0" w:uiPriority="72" w:semiHidden="0" w:name="Colorful List"/>
+    <w:lsdException w:unhideWhenUsed="0" w:uiPriority="73" w:semiHidden="0" w:name="Colorful Grid"/>
+    <w:lsdException w:unhideWhenUsed="0" w:uiPriority="60" w:semiHidden="0" w:name="Light Shading Accent 1"/>
+    <w:lsdException w:unhideWhenUsed="0" w:uiPriority="61" w:semiHidden="0" w:name="Light List Accent 1"/>
+    <w:lsdException w:unhideWhenUsed="0" w:uiPriority="62" w:semiHidden="0" w:name="Light Grid Accent 1"/>
+    <w:lsdException w:unhideWhenUsed="0" w:uiPriority="63" w:semiHidden="0" w:name="Medium Shading 1 Accent 1"/>
+    <w:lsdException w:unhideWhenUsed="0" w:uiPriority="64" w:semiHidden="0" w:name="Medium Shading 2 Accent 1"/>
+    <w:lsdException w:unhideWhenUsed="0" w:uiPriority="65" w:semiHidden="0" w:name="Medium List 1 Accent 1"/>
     <w:lsdException w:qFormat="1" w:unhideWhenUsed="0" w:uiPriority="34" w:semiHidden="0" w:name="List Paragraph"/>
+    <w:lsdException w:unhideWhenUsed="0" w:uiPriority="66" w:semiHidden="0" w:name="Medium List 2 Accent 1"/>
+    <w:lsdException w:unhideWhenUsed="0" w:uiPriority="67" w:semiHidden="0" w:name="Medium Grid 1 Accent 1"/>
+    <w:lsdException w:unhideWhenUsed="0" w:uiPriority="68" w:semiHidden="0" w:name="Medium Grid 2 Accent 1"/>
+    <w:lsdException w:unhideWhenUsed="0" w:uiPriority="69" w:semiHidden="0" w:name="Medium Grid 3 Accent 1"/>
+    <w:lsdException w:unhideWhenUsed="0" w:uiPriority="70" w:semiHidden="0" w:name="Dark List Accent 1"/>
+    <w:lsdException w:unhideWhenUsed="0" w:uiPriority="71" w:semiHidden="0" w:name="Colorful Shading Accent 1"/>
+    <w:lsdException w:unhideWhenUsed="0" w:uiPriority="72" w:semiHidden="0" w:name="Colorful List Accent 1"/>
+    <w:lsdException w:unhideWhenUsed="0" w:uiPriority="73" w:semiHidden="0" w:name="Colorful Grid Accent 1"/>
+    <w:lsdException w:unhideWhenUsed="0" w:uiPriority="60" w:semiHidden="0" w:name="Light Shading Accent 2"/>
+    <w:lsdException w:unhideWhenUsed="0" w:uiPriority="61" w:semiHidden="0" w:name="Light List Accent 2"/>
+    <w:lsdException w:unhideWhenUsed="0" w:uiPriority="62" w:semiHidden="0" w:name="Light Grid Accent 2"/>
+    <w:lsdException w:unhideWhenUsed="0" w:uiPriority="63" w:semiHidden="0" w:name="Medium Shading 1 Accent 2"/>
+    <w:lsdException w:unhideWhenUsed="0" w:uiPriority="64" w:semiHidden="0" w:name="Medium Shading 2 Accent 2"/>
+    <w:lsdException w:unhideWhenUsed="0" w:uiPriority="65" w:semiHidden="0" w:name="Medium List 1 Accent 2"/>
+    <w:lsdException w:unhideWhenUsed="0" w:uiPriority="66" w:semiHidden="0" w:name="Medium List 2 Accent 2"/>
+    <w:lsdException w:unhideWhenUsed="0" w:uiPriority="67" w:semiHidden="0" w:name="Medium Grid 1 Accent 2"/>
+    <w:lsdException w:unhideWhenUsed="0" w:uiPriority="68" w:semiHidden="0" w:name="Medium Grid 2 Accent 2"/>
+    <w:lsdException w:unhideWhenUsed="0" w:uiPriority="69" w:semiHidden="0" w:name="Medium Grid 3 Accent 2"/>
+    <w:lsdException w:unhideWhenUsed="0" w:uiPriority="70" w:semiHidden="0" w:name="Dark List Accent 2"/>
+    <w:lsdException w:unhideWhenUsed="0" w:uiPriority="71" w:semiHidden="0" w:name="Colorful Shading Accent 2"/>
+    <w:lsdException w:unhideWhenUsed="0" w:uiPriority="72" w:semiHidden="0" w:name="Colorful List Accent 2"/>
+    <w:lsdException w:unhideWhenUsed="0" w:uiPriority="73" w:semiHidden="0" w:name="Colorful Grid Accent 2"/>
+    <w:lsdException w:unhideWhenUsed="0" w:uiPriority="60" w:semiHidden="0" w:name="Light Shading Accent 3"/>
+    <w:lsdException w:unhideWhenUsed="0" w:uiPriority="61" w:semiHidden="0" w:name="Light List Accent 3"/>
+    <w:lsdException w:unhideWhenUsed="0" w:uiPriority="62" w:semiHidden="0" w:name="Light Grid Accent 3"/>
+    <w:lsdException w:unhideWhenUsed="0" w:uiPriority="63" w:semiHidden="0" w:name="Medium Shading 1 Accent 3"/>
+    <w:lsdException w:unhideWhenUsed="0" w:uiPriority="64" w:semiHidden="0" w:name="Medium Shading 2 Accent 3"/>
+    <w:lsdException w:unhideWhenUsed="0" w:uiPriority="65" w:semiHidden="0" w:name="Medium List 1 Accent 3"/>
+    <w:lsdException w:unhideWhenUsed="0" w:uiPriority="66" w:semiHidden="0" w:name="Medium List 2 Accent 3"/>
+    <w:lsdException w:unhideWhenUsed="0" w:uiPriority="67" w:semiHidden="0" w:name="Medium Grid 1 Accent 3"/>
+    <w:lsdException w:unhideWhenUsed="0" w:uiPriority="68" w:semiHidden="0" w:name="Medium Grid 2 Accent 3"/>
+    <w:lsdException w:unhideWhenUsed="0" w:uiPriority="69" w:semiHidden="0" w:name="Medium Grid 3 Accent 3"/>
+    <w:lsdException w:unhideWhenUsed="0" w:uiPriority="70" w:semiHidden="0" w:name="Dark List Accent 3"/>
+    <w:lsdException w:unhideWhenUsed="0" w:uiPriority="71" w:semiHidden="0" w:name="Colorful Shading Accent 3"/>
+    <w:lsdException w:unhideWhenUsed="0" w:uiPriority="72" w:semiHidden="0" w:name="Colorful List Accent 3"/>
+    <w:lsdException w:unhideWhenUsed="0" w:uiPriority="73" w:semiHidden="0" w:name="Colorful Grid Accent 3"/>
+    <w:lsdException w:unhideWhenUsed="0" w:uiPriority="60" w:semiHidden="0" w:name="Light Shading Accent 4"/>
+    <w:lsdException w:unhideWhenUsed="0" w:uiPriority="61" w:semiHidden="0" w:name="Light List Accent 4"/>
+    <w:lsdException w:unhideWhenUsed="0" w:uiPriority="62" w:semiHidden="0" w:name="Light Grid Accent 4"/>
+    <w:lsdException w:unhideWhenUsed="0" w:uiPriority="63" w:semiHidden="0" w:name="Medium Shading 1 Accent 4"/>
+    <w:lsdException w:unhideWhenUsed="0" w:uiPriority="64" w:semiHidden="0" w:name="Medium Shading 2 Accent 4"/>
+    <w:lsdException w:unhideWhenUsed="0" w:uiPriority="65" w:semiHidden="0" w:name="Medium List 1 Accent 4"/>
+    <w:lsdException w:unhideWhenUsed="0" w:uiPriority="66" w:semiHidden="0" w:name="Medium List 2 Accent 4"/>
+    <w:lsdException w:unhideWhenUsed="0" w:uiPriority="67" w:semiHidden="0" w:name="Medium Grid 1 Accent 4"/>
+    <w:lsdException w:unhideWhenUsed="0" w:uiPriority="68" w:semiHidden="0" w:name="Medium Grid 2 Accent 4"/>
+    <w:lsdException w:unhideWhenUsed="0" w:uiPriority="69" w:semiHidden="0" w:name="Medium Grid 3 Accent 4"/>
+    <w:lsdException w:unhideWhenUsed="0" w:uiPriority="70" w:semiHidden="0" w:name="Dark List Accent 4"/>
+    <w:lsdException w:unhideWhenUsed="0" w:uiPriority="71" w:semiHidden="0" w:name="Colorful Shading Accent 4"/>
+    <w:lsdException w:unhideWhenUsed="0" w:uiPriority="72" w:semiHidden="0" w:name="Colorful List Accent 4"/>
+    <w:lsdException w:unhideWhenUsed="0" w:uiPriority="73" w:semiHidden="0" w:name="Colorful Grid Accent 4"/>
+    <w:lsdException w:unhideWhenUsed="0" w:uiPriority="60" w:semiHidden="0" w:name="Light Shading Accent 5"/>
+    <w:lsdException w:unhideWhenUsed="0" w:uiPriority="61" w:semiHidden="0" w:name="Light List Accent 5"/>
+    <w:lsdException w:unhideWhenUsed="0" w:uiPriority="62" w:semiHidden="0" w:name="Light Grid Accent 5"/>
+    <w:lsdException w:unhideWhenUsed="0" w:uiPriority="63" w:semiHidden="0" w:name="Medium Shading 1 Accent 5"/>
+    <w:lsdException w:unhideWhenUsed="0" w:uiPriority="64" w:semiHidden="0" w:name="Medium Shading 2 Accent 5"/>
+    <w:lsdException w:unhideWhenUsed="0" w:uiPriority="65" w:semiHidden="0" w:name="Medium List 1 Accent 5"/>
+    <w:lsdException w:unhideWhenUsed="0" w:uiPriority="66" w:semiHidden="0" w:name="Medium List 2 Accent 5"/>
+    <w:lsdException w:unhideWhenUsed="0" w:uiPriority="67" w:semiHidden="0" w:name="Medium Grid 1 Accent 5"/>
+    <w:lsdException w:unhideWhenUsed="0" w:uiPriority="68" w:semiHidden="0" w:name="Medium Grid 2 Accent 5"/>
+    <w:lsdException w:unhideWhenUsed="0" w:uiPriority="69" w:semiHidden="0" w:name="Medium Grid 3 Accent 5"/>
+    <w:lsdException w:unhideWhenUsed="0" w:uiPriority="70" w:semiHidden="0" w:name="Dark List Accent 5"/>
+    <w:lsdException w:unhideWhenUsed="0" w:uiPriority="71" w:semiHidden="0" w:name="Colorful Shading Accent 5"/>
+    <w:lsdException w:unhideWhenUsed="0" w:uiPriority="72" w:semiHidden="0" w:name="Colorful List Accent 5"/>
+    <w:lsdException w:unhideWhenUsed="0" w:uiPriority="73" w:semiHidden="0" w:name="Colorful Grid Accent 5"/>
+    <w:lsdException w:unhideWhenUsed="0" w:uiPriority="60" w:semiHidden="0" w:name="Light Shading Accent 6"/>
+    <w:lsdException w:unhideWhenUsed="0" w:uiPriority="61" w:semiHidden="0" w:name="Light List Accent 6"/>
+    <w:lsdException w:unhideWhenUsed="0" w:uiPriority="62" w:semiHidden="0" w:name="Light Grid Accent 6"/>
+    <w:lsdException w:unhideWhenUsed="0" w:uiPriority="63" w:semiHidden="0" w:name="Medium Shading 1 Accent 6"/>
+    <w:lsdException w:unhideWhenUsed="0" w:uiPriority="64" w:semiHidden="0" w:name="Medium Shading 2 Accent 6"/>
+    <w:lsdException w:unhideWhenUsed="0" w:uiPriority="65" w:semiHidden="0" w:name="Medium List 1 Accent 6"/>
+    <w:lsdException w:unhideWhenUsed="0" w:uiPriority="66" w:semiHidden="0" w:name="Medium List 2 Accent 6"/>
+    <w:lsdException w:unhideWhenUsed="0" w:uiPriority="67" w:semiHidden="0" w:name="Medium Grid 1 Accent 6"/>
+    <w:lsdException w:unhideWhenUsed="0" w:uiPriority="68" w:semiHidden="0" w:name="Medium Grid 2 Accent 6"/>
+    <w:lsdException w:unhideWhenUsed="0" w:uiPriority="69" w:semiHidden="0" w:name="Medium Grid 3 Accent 6"/>
+    <w:lsdException w:unhideWhenUsed="0" w:uiPriority="70" w:semiHidden="0" w:name="Dark List Accent 6"/>
+    <w:lsdException w:unhideWhenUsed="0" w:uiPriority="71" w:semiHidden="0" w:name="Colorful Shading Accent 6"/>
+    <w:lsdException w:unhideWhenUsed="0" w:uiPriority="72" w:semiHidden="0" w:name="Colorful List Accent 6"/>
+    <w:lsdException w:unhideWhenUsed="0" w:uiPriority="73" w:semiHidden="0" w:name="Colorful Grid Accent 6"/>
   </w:latentStyles>
   <w:style w:type="paragraph" w:default="1" w:styleId="1">
     <w:name w:val="Normal"/>
     <w:qFormat/>
     <w:uiPriority w:val="0"/>
     <w:pPr>
-      <w:spacing w:after="0" w:line="240" w:lineRule="auto"/>
+      <w:spacing w:after="0" w:line="360" w:lineRule="auto"/>
     </w:pPr>
     <w:rPr>
       <w:rFonts w:ascii="Times New Roman" w:hAnsi="Times New Roman" w:eastAsia="Times New Roman" w:cs="Times New Roman"/>
@@ -11141,35 +11455,7 @@
       </w:tblCellMar>
     </w:tblPr>
   </w:style>
-  <w:style w:type="character" w:styleId="7">
-    <w:name w:val="annotation reference"/>
-    <w:basedOn w:val="5"/>
-    <w:semiHidden/>
-    <w:unhideWhenUsed/>
-    <w:qFormat/>
-    <w:uiPriority w:val="99"/>
-    <w:rPr>
-      <w:sz w:val="16"/>
-      <w:szCs w:val="16"/>
-    </w:rPr>
-  </w:style>
-  <w:style w:type="character" w:styleId="8">
-    <w:name w:val="Hyperlink"/>
-    <w:basedOn w:val="5"/>
-    <w:unhideWhenUsed/>
-    <w:qFormat/>
-    <w:uiPriority w:val="99"/>
-    <w:rPr>
-      <w:color w:val="0000FF" w:themeColor="hyperlink"/>
-      <w:u w:val="single"/>
-      <w14:textFill>
-        <w14:solidFill>
-          <w14:schemeClr w14:val="hlink"/>
-        </w14:solidFill>
-      </w14:textFill>
-    </w:rPr>
-  </w:style>
-  <w:style w:type="paragraph" w:styleId="9">
+  <w:style w:type="paragraph" w:styleId="7">
     <w:name w:val="Balloon Text"/>
     <w:basedOn w:val="1"/>
     <w:link w:val="24"/>
@@ -11183,7 +11469,17 @@
       <w:szCs w:val="16"/>
     </w:rPr>
   </w:style>
-  <w:style w:type="paragraph" w:styleId="10">
+  <w:style w:type="paragraph" w:styleId="8">
+    <w:name w:val="Body Text"/>
+    <w:basedOn w:val="1"/>
+    <w:link w:val="25"/>
+    <w:qFormat/>
+    <w:uiPriority w:val="0"/>
+    <w:rPr>
+      <w:sz w:val="28"/>
+    </w:rPr>
+  </w:style>
+  <w:style w:type="paragraph" w:styleId="9">
     <w:name w:val="caption"/>
     <w:basedOn w:val="1"/>
     <w:next w:val="1"/>
@@ -11195,6 +11491,18 @@
     </w:pPr>
     <w:rPr>
       <w:rFonts w:ascii="Times New Roman" w:hAnsi="Times New Roman" w:eastAsia="黑体" w:cs="Arial"/>
+    </w:rPr>
+  </w:style>
+  <w:style w:type="character" w:styleId="10">
+    <w:name w:val="annotation reference"/>
+    <w:basedOn w:val="5"/>
+    <w:semiHidden/>
+    <w:unhideWhenUsed/>
+    <w:qFormat/>
+    <w:uiPriority w:val="99"/>
+    <w:rPr>
+      <w:sz w:val="16"/>
+      <w:szCs w:val="16"/>
     </w:rPr>
   </w:style>
   <w:style w:type="paragraph" w:styleId="11">
@@ -11225,6 +11533,20 @@
     </w:rPr>
   </w:style>
   <w:style w:type="paragraph" w:styleId="13">
+    <w:name w:val="footer"/>
+    <w:basedOn w:val="1"/>
+    <w:link w:val="28"/>
+    <w:unhideWhenUsed/>
+    <w:qFormat/>
+    <w:uiPriority w:val="99"/>
+    <w:pPr>
+      <w:tabs>
+        <w:tab w:val="center" w:pos="4677"/>
+        <w:tab w:val="right" w:pos="9355"/>
+      </w:tabs>
+    </w:pPr>
+  </w:style>
+  <w:style w:type="paragraph" w:styleId="14">
     <w:name w:val="header"/>
     <w:basedOn w:val="1"/>
     <w:link w:val="27"/>
@@ -11238,95 +11560,7 @@
       </w:tabs>
     </w:pPr>
   </w:style>
-  <w:style w:type="paragraph" w:styleId="14">
-    <w:name w:val="Body Text"/>
-    <w:basedOn w:val="1"/>
-    <w:link w:val="25"/>
-    <w:qFormat/>
-    <w:uiPriority w:val="0"/>
-    <w:rPr>
-      <w:sz w:val="28"/>
-    </w:rPr>
-  </w:style>
   <w:style w:type="paragraph" w:styleId="15">
-    <w:name w:val="toc 1"/>
-    <w:basedOn w:val="1"/>
-    <w:next w:val="1"/>
-    <w:unhideWhenUsed/>
-    <w:qFormat/>
-    <w:uiPriority w:val="39"/>
-    <w:pPr>
-      <w:spacing w:after="100" w:line="276" w:lineRule="auto"/>
-    </w:pPr>
-    <w:rPr>
-      <w:rFonts w:asciiTheme="minorHAnsi" w:hAnsiTheme="minorHAnsi" w:eastAsiaTheme="minorEastAsia" w:cstheme="minorBidi"/>
-      <w:sz w:val="22"/>
-      <w:szCs w:val="22"/>
-      <w:lang w:eastAsia="en-US"/>
-    </w:rPr>
-  </w:style>
-  <w:style w:type="paragraph" w:styleId="16">
-    <w:name w:val="toc 3"/>
-    <w:basedOn w:val="1"/>
-    <w:next w:val="1"/>
-    <w:unhideWhenUsed/>
-    <w:qFormat/>
-    <w:uiPriority w:val="39"/>
-    <w:pPr>
-      <w:spacing w:after="100" w:line="276" w:lineRule="auto"/>
-      <w:ind w:left="440"/>
-    </w:pPr>
-    <w:rPr>
-      <w:rFonts w:asciiTheme="minorHAnsi" w:hAnsiTheme="minorHAnsi" w:eastAsiaTheme="minorEastAsia" w:cstheme="minorBidi"/>
-      <w:sz w:val="22"/>
-      <w:szCs w:val="22"/>
-      <w:lang w:eastAsia="en-US"/>
-    </w:rPr>
-  </w:style>
-  <w:style w:type="paragraph" w:styleId="17">
-    <w:name w:val="toc 2"/>
-    <w:basedOn w:val="1"/>
-    <w:next w:val="1"/>
-    <w:unhideWhenUsed/>
-    <w:qFormat/>
-    <w:uiPriority w:val="39"/>
-    <w:pPr>
-      <w:spacing w:after="100" w:line="276" w:lineRule="auto"/>
-      <w:ind w:left="220"/>
-    </w:pPr>
-    <w:rPr>
-      <w:rFonts w:asciiTheme="minorHAnsi" w:hAnsiTheme="minorHAnsi" w:eastAsiaTheme="minorEastAsia" w:cstheme="minorBidi"/>
-      <w:sz w:val="22"/>
-      <w:szCs w:val="22"/>
-      <w:lang w:eastAsia="en-US"/>
-    </w:rPr>
-  </w:style>
-  <w:style w:type="paragraph" w:styleId="18">
-    <w:name w:val="footer"/>
-    <w:basedOn w:val="1"/>
-    <w:link w:val="28"/>
-    <w:unhideWhenUsed/>
-    <w:qFormat/>
-    <w:uiPriority w:val="99"/>
-    <w:pPr>
-      <w:tabs>
-        <w:tab w:val="center" w:pos="4677"/>
-        <w:tab w:val="right" w:pos="9355"/>
-      </w:tabs>
-    </w:pPr>
-  </w:style>
-  <w:style w:type="paragraph" w:styleId="19">
-    <w:name w:val="Normal (Web)"/>
-    <w:basedOn w:val="1"/>
-    <w:semiHidden/>
-    <w:unhideWhenUsed/>
-    <w:qFormat/>
-    <w:uiPriority w:val="99"/>
-    <w:pPr>
-      <w:spacing w:before="100" w:beforeAutospacing="1" w:after="100" w:afterAutospacing="1"/>
-    </w:pPr>
-  </w:style>
-  <w:style w:type="paragraph" w:styleId="20">
     <w:name w:val="HTML Preformatted"/>
     <w:basedOn w:val="1"/>
     <w:link w:val="31"/>
@@ -11361,7 +11595,34 @@
       <w:lang w:eastAsia="en-US"/>
     </w:rPr>
   </w:style>
-  <w:style w:type="table" w:styleId="21">
+  <w:style w:type="character" w:styleId="16">
+    <w:name w:val="Hyperlink"/>
+    <w:basedOn w:val="5"/>
+    <w:unhideWhenUsed/>
+    <w:qFormat/>
+    <w:uiPriority w:val="99"/>
+    <w:rPr>
+      <w:color w:val="0000FF" w:themeColor="hyperlink"/>
+      <w:u w:val="single"/>
+      <w14:textFill>
+        <w14:solidFill>
+          <w14:schemeClr w14:val="hlink"/>
+        </w14:solidFill>
+      </w14:textFill>
+    </w:rPr>
+  </w:style>
+  <w:style w:type="paragraph" w:styleId="17">
+    <w:name w:val="Normal (Web)"/>
+    <w:basedOn w:val="1"/>
+    <w:semiHidden/>
+    <w:unhideWhenUsed/>
+    <w:qFormat/>
+    <w:uiPriority w:val="99"/>
+    <w:pPr>
+      <w:spacing w:before="100" w:beforeAutospacing="1" w:after="100" w:afterAutospacing="1"/>
+    </w:pPr>
+  </w:style>
+  <w:style w:type="table" w:styleId="18">
     <w:name w:val="Table Grid"/>
     <w:basedOn w:val="6"/>
     <w:qFormat/>
@@ -11379,6 +11640,59 @@
         <w:insideV w:val="single" w:color="auto" w:sz="4" w:space="0"/>
       </w:tblBorders>
     </w:tblPr>
+  </w:style>
+  <w:style w:type="paragraph" w:styleId="19">
+    <w:name w:val="toc 1"/>
+    <w:basedOn w:val="1"/>
+    <w:next w:val="1"/>
+    <w:unhideWhenUsed/>
+    <w:qFormat/>
+    <w:uiPriority w:val="39"/>
+    <w:pPr>
+      <w:spacing w:after="100" w:line="276" w:lineRule="auto"/>
+    </w:pPr>
+    <w:rPr>
+      <w:rFonts w:asciiTheme="minorHAnsi" w:hAnsiTheme="minorHAnsi" w:eastAsiaTheme="minorEastAsia" w:cstheme="minorBidi"/>
+      <w:sz w:val="22"/>
+      <w:szCs w:val="22"/>
+      <w:lang w:eastAsia="en-US"/>
+    </w:rPr>
+  </w:style>
+  <w:style w:type="paragraph" w:styleId="20">
+    <w:name w:val="toc 2"/>
+    <w:basedOn w:val="1"/>
+    <w:next w:val="1"/>
+    <w:unhideWhenUsed/>
+    <w:qFormat/>
+    <w:uiPriority w:val="39"/>
+    <w:pPr>
+      <w:spacing w:after="100" w:line="276" w:lineRule="auto"/>
+      <w:ind w:left="220"/>
+    </w:pPr>
+    <w:rPr>
+      <w:rFonts w:asciiTheme="minorHAnsi" w:hAnsiTheme="minorHAnsi" w:eastAsiaTheme="minorEastAsia" w:cstheme="minorBidi"/>
+      <w:sz w:val="22"/>
+      <w:szCs w:val="22"/>
+      <w:lang w:eastAsia="en-US"/>
+    </w:rPr>
+  </w:style>
+  <w:style w:type="paragraph" w:styleId="21">
+    <w:name w:val="toc 3"/>
+    <w:basedOn w:val="1"/>
+    <w:next w:val="1"/>
+    <w:unhideWhenUsed/>
+    <w:qFormat/>
+    <w:uiPriority w:val="39"/>
+    <w:pPr>
+      <w:spacing w:after="100" w:line="276" w:lineRule="auto"/>
+      <w:ind w:left="440"/>
+    </w:pPr>
+    <w:rPr>
+      <w:rFonts w:asciiTheme="minorHAnsi" w:hAnsiTheme="minorHAnsi" w:eastAsiaTheme="minorEastAsia" w:cstheme="minorBidi"/>
+      <w:sz w:val="22"/>
+      <w:szCs w:val="22"/>
+      <w:lang w:eastAsia="en-US"/>
+    </w:rPr>
   </w:style>
   <w:style w:type="character" w:customStyle="1" w:styleId="22">
     <w:name w:val="Заголовок 1 Знак"/>
@@ -11409,7 +11723,7 @@
   <w:style w:type="character" w:customStyle="1" w:styleId="24">
     <w:name w:val="Текст выноски Знак"/>
     <w:basedOn w:val="5"/>
-    <w:link w:val="9"/>
+    <w:link w:val="7"/>
     <w:semiHidden/>
     <w:qFormat/>
     <w:uiPriority w:val="99"/>
@@ -11423,7 +11737,7 @@
   <w:style w:type="character" w:customStyle="1" w:styleId="25">
     <w:name w:val="Основной текст Знак"/>
     <w:basedOn w:val="5"/>
-    <w:link w:val="14"/>
+    <w:link w:val="8"/>
     <w:qFormat/>
     <w:uiPriority w:val="0"/>
     <w:rPr>
@@ -11454,7 +11768,7 @@
   <w:style w:type="character" w:customStyle="1" w:styleId="27">
     <w:name w:val="Верхний колонтитул Знак"/>
     <w:basedOn w:val="5"/>
-    <w:link w:val="13"/>
+    <w:link w:val="14"/>
     <w:qFormat/>
     <w:uiPriority w:val="99"/>
     <w:rPr>
@@ -11467,7 +11781,7 @@
   <w:style w:type="character" w:customStyle="1" w:styleId="28">
     <w:name w:val="Нижний колонтитул Знак"/>
     <w:basedOn w:val="5"/>
-    <w:link w:val="18"/>
+    <w:link w:val="13"/>
     <w:qFormat/>
     <w:uiPriority w:val="99"/>
     <w:rPr>
@@ -11510,7 +11824,7 @@
   <w:style w:type="character" w:customStyle="1" w:styleId="31">
     <w:name w:val="Стандартный HTML Знак"/>
     <w:basedOn w:val="5"/>
-    <w:link w:val="20"/>
+    <w:link w:val="15"/>
     <w:semiHidden/>
     <w:qFormat/>
     <w:uiPriority w:val="99"/>

</xml_diff>